<commit_message>
feat: updating focus to Product Engineering and fleshed out Signal Ocean Experience
</commit_message>
<xml_diff>
--- a/docs/my-resume.docx
+++ b/docs/my-resume.docx
@@ -66,7 +66,7 @@
           <w:color w:val="4F5563"/>
           <w:sz w:val="20"/>
         </w:rPr>
-        <w:t>Hove, United Kingdom | davi.naizer@gmail.com | LinkedIn: linkedin.com/in/your-linkedin-handle | Languages: English (C1), Portuguese</w:t>
+        <w:t>Hove, United Kingdom | davi.naizer@gmail.com | LinkedIn: linkedin.com/in/davi-naizer | Languages: English (C1), Portuguese</w:t>
       </w:r>
     </w:p>
     <w:p>
@@ -101,7 +101,7 @@
           <w:color w:val="000000"/>
           <w:sz w:val="21"/>
         </w:rPr>
-        <w:t>Senior Frontend Engineer with 13+ years of experience delivering product-focused web applications across frontend architecture, UX workflows, and systems-aware engineering.</w:t>
+        <w:t>Senior Frontend Engineer with 13+ years of experience delivering product-focused web applications across React, TypeScript, frontend architecture, and engineering workflow improvement.</w:t>
       </w:r>
     </w:p>
     <w:p>
@@ -116,7 +116,7 @@
           <w:color w:val="000000"/>
           <w:sz w:val="21"/>
         </w:rPr>
-        <w:t>Specialises in React, TypeScript, and frontend product engineering with a strong focus on reliability, maintainability, testing, and developer experience. Experienced in building scalable user-facing systems, improving engineering workflows, and collaborating closely with product, design, and backend teams.</w:t>
+        <w:t>Experienced in identifying operational friction, improving delivery systems, and building user-facing products in collaboration with product, design, and backend teams. Recent work has included deployment automation across 29 repositories, internal tooling that reduced operational processes from days to minutes, and frontend systems supporting complex operational workflows and decision-making.</w:t>
       </w:r>
     </w:p>
     <w:p>
@@ -131,7 +131,7 @@
           <w:color w:val="000000"/>
           <w:sz w:val="21"/>
         </w:rPr>
-        <w:t>Strong background in onboarding improvements, process automation, frontend systems coordination, and engineering enablement across complex product environments. Known for calm collaborative leadership, high ownership, and pragmatic problem-solving.</w:t>
+        <w:t>Strongest areas include frontend product engineering, developer experience, workflow reliability, onboarding systems, and cross-functional delivery. Particularly interested in understanding user and operational problems, then building maintainable solutions that improve how people work while balancing engineering quality and sustainable delivery.</w:t>
       </w:r>
     </w:p>
     <w:p>
@@ -483,7 +483,7 @@
           <w:color w:val="000000"/>
           <w:sz w:val="21"/>
         </w:rPr>
-        <w:t>Worked on the Signal Ocean platform, a data-intensive maritime analytics product with complex map-based operational workflows and real-time data visualisation.</w:t>
+        <w:t>Worked on the Signal Ocean platform, a data-intensive maritime analytics platform supporting real-time operational decision-making workflows, complex map-based experiences, and large-scale data visualisation.</w:t>
       </w:r>
     </w:p>
     <w:p>
@@ -515,7 +515,7 @@
           <w:color w:val="000000"/>
           <w:sz w:val="21"/>
         </w:rPr>
-        <w:t>Collaborated with backend engineers on REST API endpoints for dynamic vessel-list template generation, reducing manual configuration in operational workflows.</w:t>
+        <w:t>Collaborated with backend engineers on API design and implementation for dynamic vessel-list template generation, enabling self-service workflow configuration within the platform.</w:t>
       </w:r>
     </w:p>
     <w:p>
@@ -531,7 +531,7 @@
           <w:color w:val="000000"/>
           <w:sz w:val="21"/>
         </w:rPr>
-        <w:t>Improved frontend usability and workflow efficiency by enabling user-driven template creation and reducing dependency on manual configuration processes.</w:t>
+        <w:t>Delivered self-service workflow capabilities that reduced reliance on manual template configuration and improved usability for operational users managing vessel-tracking workflows.</w:t>
       </w:r>
     </w:p>
     <w:p>
@@ -547,7 +547,7 @@
           <w:color w:val="000000"/>
           <w:sz w:val="21"/>
         </w:rPr>
-        <w:t>Worked across frontend architecture, API integration, and shared state management in a data-heavy product environment.</w:t>
+        <w:t>Owned frontend implementation across API integration, shared state management, and map-based analytics experiences in a data-rich operational product.</w:t>
       </w:r>
     </w:p>
     <w:p>
@@ -727,7 +727,7 @@
           <w:color w:val="000000"/>
           <w:sz w:val="21"/>
         </w:rPr>
-        <w:t>Improved onboarding and engineering consistency through code reviews, dependency mapping, workflow documentation, and collaborative technical guidance for frontend developers.</w:t>
+        <w:t>Led onboarding and documentation modernization efforts, creating dependency maps, architectural diagrams, and structured guidance that improved developer self-sufficiency and reduced reliance on tribal knowledge.</w:t>
       </w:r>
     </w:p>
     <w:p>
@@ -743,7 +743,7 @@
           <w:color w:val="000000"/>
           <w:sz w:val="21"/>
         </w:rPr>
-        <w:t>Contributed to platform and tooling discussions, roadmap planning, and delivery coordination using UML and C4 modelling approaches.</w:t>
+        <w:t>Helped shape frontend modernization initiatives through roadmap planning, architecture discussions, platform tooling improvements, and delivery coordination across multiple teams.</w:t>
       </w:r>
     </w:p>
     <w:p>
@@ -891,7 +891,7 @@
           <w:color w:val="000000"/>
           <w:sz w:val="21"/>
         </w:rPr>
-        <w:t>Built a Node.js CLI tool integrating with the Jira REST API to automate offer-content production, reducing lead time from 2–3 days to about 15 minutes.</w:t>
+        <w:t>Identified an operational bottleneck and delivered a Node.js CLI tool integrating with the Jira REST API to automate offer-content production, reducing lead time from 2–3 days to about 15 minutes.</w:t>
       </w:r>
     </w:p>
     <w:p>
@@ -923,7 +923,7 @@
           <w:color w:val="000000"/>
           <w:sz w:val="21"/>
         </w:rPr>
-        <w:t>Developed internal tooling and deployment workflows that reduced manual coordination, simplified operational processes, and improved delivery consistency across engineering and content teams.</w:t>
+        <w:t>Reduced coordination overhead and delivery friction by building internal tooling and deployment workflows that simplified release processes across engineering and content teams.</w:t>
       </w:r>
     </w:p>
     <w:p>
@@ -939,7 +939,7 @@
           <w:color w:val="000000"/>
           <w:sz w:val="21"/>
         </w:rPr>
-        <w:t>Improved onboarding and knowledge-sharing by restructuring team documentation, simplifying internal guidance, and reducing dependency on tribal knowledge.</w:t>
+        <w:t>Created onboarding resources, architectural diagrams, and dependency maps that improved team self-sufficiency and reduced onboarding friction.</w:t>
       </w:r>
     </w:p>
     <w:p>
@@ -955,7 +955,7 @@
           <w:color w:val="000000"/>
           <w:sz w:val="21"/>
         </w:rPr>
-        <w:t>Supported engineering quality initiatives through code reviews, pairing, testing practices, production troubleshooting, and collaborative problem-solving across frontend teams.</w:t>
+        <w:t>Improved team effectiveness through mentoring, code pairing, testing practices, production troubleshooting, and knowledge sharing across frontend teams.</w:t>
       </w:r>
     </w:p>
     <w:p>
@@ -1119,7 +1119,7 @@
           <w:color w:val="000000"/>
           <w:sz w:val="21"/>
         </w:rPr>
-        <w:t>Developed deployment-visibility tooling integrating with the GitHub REST API to improve operational transparency and reduce troubleshooting overhead.</w:t>
+        <w:t>Designed and developed deployment-visibility tooling integrating with the GitHub REST API to improve operational transparency and reduce troubleshooting overhead.</w:t>
       </w:r>
     </w:p>
     <w:p>
@@ -1467,7 +1467,7 @@
           <w:color w:val="000000"/>
           <w:sz w:val="21"/>
         </w:rPr>
-        <w:t>Modern SwiftUI-based product project focused on onboarding, recommendations, async state management, and maintainable frontend systems.</w:t>
+        <w:t>SwiftUI-based product engineering project built to explore modern mobile architecture, AI-assisted development workflows, onboarding experiences, and maintainable application design.</w:t>
       </w:r>
     </w:p>
     <w:p>
@@ -1499,23 +1499,7 @@
           <w:color w:val="000000"/>
           <w:sz w:val="21"/>
         </w:rPr>
-        <w:t>Used structured AI-assisted workflows with review and verification practices to support maintainable implementation and faster iteration.</w:t>
-      </w:r>
-    </w:p>
-    <w:p>
-      <w:pPr>
-        <w:pStyle w:val="ListBullet"/>
-        <w:spacing w:before="0" w:after="0" w:lineRule="auto" w:line="269"/>
-      </w:pPr>
-      <w:r>
-        <w:rPr>
-          <w:rFonts w:ascii="IBM Plex Sans" w:hAnsi="IBM Plex Sans"/>
-          <w:b w:val="0"/>
-          <w:i w:val="0"/>
-          <w:color w:val="000000"/>
-          <w:sz w:val="21"/>
-        </w:rPr>
-        <w:t>Integrated typed API flows, persistence, notification routing, and testable state management in a collaborative frontend/backend environment.</w:t>
+        <w:t>Used AI-assisted development workflows to accelerate implementation while maintaining review, testing, and verification standards.</w:t>
       </w:r>
     </w:p>
     <w:p>
@@ -1532,6 +1516,22 @@
           <w:sz w:val="21"/>
         </w:rPr>
         <w:t>Developed testing and verification practices supporting maintainable implementation and collaborative iteration.</w:t>
+      </w:r>
+    </w:p>
+    <w:p>
+      <w:pPr>
+        <w:pStyle w:val="ListBullet"/>
+        <w:spacing w:before="0" w:after="0" w:lineRule="auto" w:line="269"/>
+      </w:pPr>
+      <w:r>
+        <w:rPr>
+          <w:rFonts w:ascii="IBM Plex Sans" w:hAnsi="IBM Plex Sans"/>
+          <w:b w:val="0"/>
+          <w:i w:val="0"/>
+          <w:color w:val="000000"/>
+          <w:sz w:val="21"/>
+        </w:rPr>
+        <w:t>Built as an end-to-end product engineering exercise covering product flows, API integration, state management, testing practices, and collaborative frontend/backend delivery.</w:t>
       </w:r>
     </w:p>
     <w:p>

</xml_diff>

<commit_message>
Extract resume styling into configurable theme
</commit_message>
<xml_diff>
--- a/docs/my-resume.docx
+++ b/docs/my-resume.docx
@@ -14,10 +14,10 @@
           <w:rFonts w:ascii="IBM Plex Sans" w:hAnsi="IBM Plex Sans"/>
           <w:b/>
           <w:i w:val="0"/>
-          <w:color w:val="10243D"/>
-          <w:sz w:val="46"/>
+          <w:color w:val="2F5FA7"/>
+          <w:sz w:val="54"/>
         </w:rPr>
-        <w:t>Davi Naizer</w:t>
+        <w:t>Davi Naizer Santos</w:t>
       </w:r>
     </w:p>
     <w:p>
@@ -32,8 +32,8 @@
           <w:rFonts w:ascii="IBM Plex Sans" w:hAnsi="IBM Plex Sans"/>
           <w:b/>
           <w:i w:val="0"/>
-          <w:color w:val="1F3A5F"/>
-          <w:sz w:val="27"/>
+          <w:color w:val="2F5FA7"/>
+          <w:sz w:val="32"/>
         </w:rPr>
         <w:t>Senior Frontend Engineer</w:t>
       </w:r>
@@ -48,7 +48,7 @@
           <w:rFonts w:ascii="IBM Plex Sans" w:hAnsi="IBM Plex Sans"/>
           <w:b w:val="0"/>
           <w:i w:val="0"/>
-          <w:color w:val="4F5563"/>
+          <w:color w:val="5E6470"/>
           <w:sz w:val="22"/>
         </w:rPr>
         <w:t>Product Engineering | Reliability &amp; Developer Experience</w:t>
@@ -63,8 +63,8 @@
           <w:rFonts w:ascii="IBM Plex Sans" w:hAnsi="IBM Plex Sans"/>
           <w:b w:val="0"/>
           <w:i w:val="0"/>
-          <w:color w:val="4F5563"/>
-          <w:sz w:val="20"/>
+          <w:color w:val="5E6470"/>
+          <w:sz w:val="21"/>
         </w:rPr>
         <w:t>Hove, United Kingdom | davi.naizer@gmail.com | LinkedIn: linkedin.com/in/davi-naizer | Languages: English (C1), Portuguese</w:t>
       </w:r>
@@ -75,7 +75,7 @@
         <w:spacing w:before="240" w:after="100" w:lineRule="auto" w:line="240"/>
         <w:keepNext/>
         <w:pBdr>
-          <w:bottom w:val="single" w:sz="8" w:space="1" w:color="BFC6D1"/>
+          <w:bottom w:val="single" w:sz="8" w:space="1" w:color="C9D2DF"/>
         </w:pBdr>
       </w:pPr>
       <w:r>
@@ -83,8 +83,8 @@
           <w:rFonts w:ascii="IBM Plex Sans" w:hAnsi="IBM Plex Sans"/>
           <w:b/>
           <w:i w:val="0"/>
-          <w:color w:val="1F3A5F"/>
-          <w:sz w:val="25"/>
+          <w:color w:val="2F5FA7"/>
+          <w:sz w:val="26"/>
         </w:rPr>
         <w:t>SUMMARY</w:t>
       </w:r>
@@ -98,8 +98,8 @@
           <w:rFonts w:ascii="IBM Plex Sans" w:hAnsi="IBM Plex Sans"/>
           <w:b w:val="0"/>
           <w:i w:val="0"/>
-          <w:color w:val="000000"/>
-          <w:sz w:val="21"/>
+          <w:color w:val="222222"/>
+          <w:sz w:val="22"/>
         </w:rPr>
         <w:t>Senior Frontend Engineer with 13+ years of experience delivering product-focused web applications across React, TypeScript, frontend architecture, and engineering workflow improvement.</w:t>
       </w:r>
@@ -113,8 +113,8 @@
           <w:rFonts w:ascii="IBM Plex Sans" w:hAnsi="IBM Plex Sans"/>
           <w:b w:val="0"/>
           <w:i w:val="0"/>
-          <w:color w:val="000000"/>
-          <w:sz w:val="21"/>
+          <w:color w:val="222222"/>
+          <w:sz w:val="22"/>
         </w:rPr>
         <w:t>Experienced in identifying operational friction, improving delivery systems, and building user-facing products in collaboration with product, design, and backend teams. Recent work has included deployment automation across 29 repositories, internal tooling that reduced operational processes from days to minutes, and frontend systems supporting complex operational workflows and decision-making.</w:t>
       </w:r>
@@ -128,8 +128,8 @@
           <w:rFonts w:ascii="IBM Plex Sans" w:hAnsi="IBM Plex Sans"/>
           <w:b w:val="0"/>
           <w:i w:val="0"/>
-          <w:color w:val="000000"/>
-          <w:sz w:val="21"/>
+          <w:color w:val="222222"/>
+          <w:sz w:val="22"/>
         </w:rPr>
         <w:t>Strongest areas include frontend product engineering, developer experience, workflow reliability, onboarding systems, and cross-functional delivery. Particularly interested in understanding user and operational problems, then building maintainable solutions that improve how people work while balancing engineering quality and sustainable delivery.</w:t>
       </w:r>
@@ -140,7 +140,7 @@
         <w:spacing w:before="240" w:after="100" w:lineRule="auto" w:line="240"/>
         <w:keepNext/>
         <w:pBdr>
-          <w:bottom w:val="single" w:sz="8" w:space="1" w:color="BFC6D1"/>
+          <w:bottom w:val="single" w:sz="8" w:space="1" w:color="C9D2DF"/>
         </w:pBdr>
       </w:pPr>
       <w:r>
@@ -148,8 +148,8 @@
           <w:rFonts w:ascii="IBM Plex Sans" w:hAnsi="IBM Plex Sans"/>
           <w:b/>
           <w:i w:val="0"/>
-          <w:color w:val="1F3A5F"/>
-          <w:sz w:val="25"/>
+          <w:color w:val="2F5FA7"/>
+          <w:sz w:val="26"/>
         </w:rPr>
         <w:t>CORE SKILLS</w:t>
       </w:r>
@@ -164,8 +164,8 @@
           <w:rFonts w:ascii="IBM Plex Sans" w:hAnsi="IBM Plex Sans"/>
           <w:b/>
           <w:i w:val="0"/>
-          <w:color w:val="1F3A5F"/>
-          <w:sz w:val="21"/>
+          <w:color w:val="2F5FA7"/>
+          <w:sz w:val="22"/>
         </w:rPr>
         <w:t>Frontend</w:t>
       </w:r>
@@ -174,8 +174,8 @@
           <w:rFonts w:ascii="IBM Plex Sans" w:hAnsi="IBM Plex Sans"/>
           <w:b w:val="0"/>
           <w:i w:val="0"/>
-          <w:color w:val="000000"/>
-          <w:sz w:val="21"/>
+          <w:color w:val="222222"/>
+          <w:sz w:val="22"/>
         </w:rPr>
         <w:t>: React, TypeScript, JavaScript (ES6+), Next.js, HTML5, CSS3, Sass</w:t>
       </w:r>
@@ -190,8 +190,8 @@
           <w:rFonts w:ascii="IBM Plex Sans" w:hAnsi="IBM Plex Sans"/>
           <w:b/>
           <w:i w:val="0"/>
-          <w:color w:val="1F3A5F"/>
-          <w:sz w:val="21"/>
+          <w:color w:val="2F5FA7"/>
+          <w:sz w:val="22"/>
         </w:rPr>
         <w:t>Product Engineering</w:t>
       </w:r>
@@ -200,8 +200,8 @@
           <w:rFonts w:ascii="IBM Plex Sans" w:hAnsi="IBM Plex Sans"/>
           <w:b w:val="0"/>
           <w:i w:val="0"/>
-          <w:color w:val="000000"/>
-          <w:sz w:val="21"/>
+          <w:color w:val="222222"/>
+          <w:sz w:val="22"/>
         </w:rPr>
         <w:t>: Frontend Architecture, State Management, API Integration, UX Workflows, Accessibility, Cross-Functional Delivery</w:t>
       </w:r>
@@ -216,8 +216,8 @@
           <w:rFonts w:ascii="IBM Plex Sans" w:hAnsi="IBM Plex Sans"/>
           <w:b/>
           <w:i w:val="0"/>
-          <w:color w:val="1F3A5F"/>
-          <w:sz w:val="21"/>
+          <w:color w:val="2F5FA7"/>
+          <w:sz w:val="22"/>
         </w:rPr>
         <w:t>Testing &amp; Reliability</w:t>
       </w:r>
@@ -226,8 +226,8 @@
           <w:rFonts w:ascii="IBM Plex Sans" w:hAnsi="IBM Plex Sans"/>
           <w:b w:val="0"/>
           <w:i w:val="0"/>
-          <w:color w:val="000000"/>
-          <w:sz w:val="21"/>
+          <w:color w:val="222222"/>
+          <w:sz w:val="22"/>
         </w:rPr>
         <w:t>: Jest, React Testing Library, Cypress, Playwright, WebDriverIO, CI/CD, Observability</w:t>
       </w:r>
@@ -242,8 +242,8 @@
           <w:rFonts w:ascii="IBM Plex Sans" w:hAnsi="IBM Plex Sans"/>
           <w:b/>
           <w:i w:val="0"/>
-          <w:color w:val="1F3A5F"/>
-          <w:sz w:val="21"/>
+          <w:color w:val="2F5FA7"/>
+          <w:sz w:val="22"/>
         </w:rPr>
         <w:t>Workflow &amp; DX</w:t>
       </w:r>
@@ -252,8 +252,8 @@
           <w:rFonts w:ascii="IBM Plex Sans" w:hAnsi="IBM Plex Sans"/>
           <w:b w:val="0"/>
           <w:i w:val="0"/>
-          <w:color w:val="000000"/>
-          <w:sz w:val="21"/>
+          <w:color w:val="222222"/>
+          <w:sz w:val="22"/>
         </w:rPr>
         <w:t>: GitHub Actions, Jenkins, Azure DevOps, Nx, Webpack, Developer Experience (DX), Process Automation</w:t>
       </w:r>
@@ -268,8 +268,8 @@
           <w:rFonts w:ascii="IBM Plex Sans" w:hAnsi="IBM Plex Sans"/>
           <w:b/>
           <w:i w:val="0"/>
-          <w:color w:val="1F3A5F"/>
-          <w:sz w:val="21"/>
+          <w:color w:val="2F5FA7"/>
+          <w:sz w:val="22"/>
         </w:rPr>
         <w:t>Supporting Technologies</w:t>
       </w:r>
@@ -278,8 +278,8 @@
           <w:rFonts w:ascii="IBM Plex Sans" w:hAnsi="IBM Plex Sans"/>
           <w:b w:val="0"/>
           <w:i w:val="0"/>
-          <w:color w:val="000000"/>
-          <w:sz w:val="21"/>
+          <w:color w:val="222222"/>
+          <w:sz w:val="22"/>
         </w:rPr>
         <w:t>: Node.js, REST APIs, Docker, AWS, Firebase</w:t>
       </w:r>
@@ -290,7 +290,7 @@
         <w:spacing w:before="240" w:after="100" w:lineRule="auto" w:line="240"/>
         <w:keepNext/>
         <w:pBdr>
-          <w:bottom w:val="single" w:sz="8" w:space="1" w:color="BFC6D1"/>
+          <w:bottom w:val="single" w:sz="8" w:space="1" w:color="C9D2DF"/>
         </w:pBdr>
       </w:pPr>
       <w:r>
@@ -298,8 +298,8 @@
           <w:rFonts w:ascii="IBM Plex Sans" w:hAnsi="IBM Plex Sans"/>
           <w:b/>
           <w:i w:val="0"/>
-          <w:color w:val="1F3A5F"/>
-          <w:sz w:val="25"/>
+          <w:color w:val="2F5FA7"/>
+          <w:sz w:val="26"/>
         </w:rPr>
         <w:t>PROFESSIONAL EXPERIENCE</w:t>
       </w:r>
@@ -344,8 +344,8 @@
                 <w:rFonts w:ascii="IBM Plex Sans" w:hAnsi="IBM Plex Sans"/>
                 <w:b/>
                 <w:i w:val="0"/>
-                <w:color w:val="000000"/>
-                <w:sz w:val="21"/>
+                <w:color w:val="222222"/>
+                <w:sz w:val="24"/>
               </w:rPr>
               <w:t>Career Break | Independent Product &amp; Technical Development</w:t>
             </w:r>
@@ -371,8 +371,8 @@
                 <w:rFonts w:ascii="IBM Plex Sans" w:hAnsi="IBM Plex Sans"/>
                 <w:b w:val="0"/>
                 <w:i w:val="0"/>
-                <w:color w:val="000000"/>
-                <w:sz w:val="21"/>
+                <w:color w:val="222222"/>
+                <w:sz w:val="20"/>
               </w:rPr>
               <w:t>11/2024 – Present</w:t>
             </w:r>
@@ -389,8 +389,8 @@
           <w:rFonts w:ascii="IBM Plex Sans" w:hAnsi="IBM Plex Sans"/>
           <w:b w:val="0"/>
           <w:i w:val="0"/>
-          <w:color w:val="000000"/>
-          <w:sz w:val="21"/>
+          <w:color w:val="222222"/>
+          <w:sz w:val="22"/>
         </w:rPr>
         <w:t>Structured sabbatical focused on technical modernization, sustainable work practices, and exploration of AI-assisted engineering workflows while continuing hands-on development across frontend and mobile technologies.</w:t>
       </w:r>
@@ -435,8 +435,8 @@
                 <w:rFonts w:ascii="IBM Plex Sans" w:hAnsi="IBM Plex Sans"/>
                 <w:b/>
                 <w:i w:val="0"/>
-                <w:color w:val="000000"/>
-                <w:sz w:val="21"/>
+                <w:color w:val="222222"/>
+                <w:sz w:val="24"/>
               </w:rPr>
               <w:t>Senior Frontend Software Engineer | The Signal Group | London, UK</w:t>
             </w:r>
@@ -462,8 +462,8 @@
                 <w:rFonts w:ascii="IBM Plex Sans" w:hAnsi="IBM Plex Sans"/>
                 <w:b w:val="0"/>
                 <w:i w:val="0"/>
-                <w:color w:val="000000"/>
-                <w:sz w:val="21"/>
+                <w:color w:val="222222"/>
+                <w:sz w:val="20"/>
               </w:rPr>
               <w:t>12/2023 – 10/2024</w:t>
             </w:r>
@@ -480,10 +480,10 @@
           <w:rFonts w:ascii="IBM Plex Sans" w:hAnsi="IBM Plex Sans"/>
           <w:b w:val="0"/>
           <w:i w:val="0"/>
-          <w:color w:val="000000"/>
-          <w:sz w:val="21"/>
+          <w:color w:val="222222"/>
+          <w:sz w:val="22"/>
         </w:rPr>
-        <w:t>Worked on the Signal Ocean platform, a data-intensive maritime analytics platform supporting real-time operational decision-making workflows, complex map-based experiences, and large-scale data visualisation.</w:t>
+        <w:t>Worked on the Signal Ocean platform, a maritime intelligence product used by charterers, brokers, operators, and analysts to monitor vessel activity, manage operational workflows, and make data-driven commercial decisions using large-scale shipping and market data.</w:t>
       </w:r>
     </w:p>
     <w:p>
@@ -496,10 +496,10 @@
           <w:rFonts w:ascii="IBM Plex Sans" w:hAnsi="IBM Plex Sans"/>
           <w:b w:val="0"/>
           <w:i w:val="0"/>
-          <w:color w:val="000000"/>
-          <w:sz w:val="21"/>
+          <w:color w:val="222222"/>
+          <w:sz w:val="22"/>
         </w:rPr>
-        <w:t>Shipped and maintained frontend features for complex dashboard and map-based analytics workflows using React, TypeScript, and OpenLayers.</w:t>
+        <w:t>Shipped and maintained frontend functionality for vessel-monitoring, analytics, and operational workflow experiences combining large-scale maritime datasets, interactive maps, and configurable user workspaces.</w:t>
       </w:r>
     </w:p>
     <w:p>
@@ -512,10 +512,10 @@
           <w:rFonts w:ascii="IBM Plex Sans" w:hAnsi="IBM Plex Sans"/>
           <w:b w:val="0"/>
           <w:i w:val="0"/>
-          <w:color w:val="000000"/>
-          <w:sz w:val="21"/>
+          <w:color w:val="222222"/>
+          <w:sz w:val="22"/>
         </w:rPr>
-        <w:t>Collaborated with backend engineers on API design and implementation for dynamic vessel-list template generation, enabling self-service workflow configuration within the platform.</w:t>
+        <w:t>Collaborated with backend engineers on metadata-driven vessel-list configuration workflows, enabling reusable templates and self-service customization across operational dashboards.</w:t>
       </w:r>
     </w:p>
     <w:p>
@@ -528,10 +528,10 @@
           <w:rFonts w:ascii="IBM Plex Sans" w:hAnsi="IBM Plex Sans"/>
           <w:b w:val="0"/>
           <w:i w:val="0"/>
-          <w:color w:val="000000"/>
-          <w:sz w:val="21"/>
+          <w:color w:val="222222"/>
+          <w:sz w:val="22"/>
         </w:rPr>
-        <w:t>Delivered self-service workflow capabilities that reduced reliance on manual template configuration and improved usability for operational users managing vessel-tracking workflows.</w:t>
+        <w:t>Delivered self-service configuration capabilities that enabled users to create and manage vessel-list templates without manual platform intervention, improving workflow flexibility and usability.</w:t>
       </w:r>
     </w:p>
     <w:p>
@@ -544,10 +544,10 @@
           <w:rFonts w:ascii="IBM Plex Sans" w:hAnsi="IBM Plex Sans"/>
           <w:b w:val="0"/>
           <w:i w:val="0"/>
-          <w:color w:val="000000"/>
-          <w:sz w:val="21"/>
+          <w:color w:val="222222"/>
+          <w:sz w:val="22"/>
         </w:rPr>
-        <w:t>Owned frontend implementation across API integration, shared state management, and map-based analytics experiences in a data-rich operational product.</w:t>
+        <w:t>Owned frontend implementation for vessel-list workflows spanning API integration, shared state management, and map-driven operational experiences within a maritime analytics platform.</w:t>
       </w:r>
     </w:p>
     <w:p>
@@ -560,10 +560,10 @@
           <w:rFonts w:ascii="IBM Plex Sans" w:hAnsi="IBM Plex Sans"/>
           <w:b w:val="0"/>
           <w:i w:val="0"/>
-          <w:color w:val="000000"/>
-          <w:sz w:val="21"/>
+          <w:color w:val="222222"/>
+          <w:sz w:val="22"/>
         </w:rPr>
-        <w:t>Contributed to maintainable delivery practices within a cross-functional engineering environment using TypeScript, MobX, and Azure DevOps.</w:t>
+        <w:t>Contributed to maintainable delivery practices within a cross-functional engineering environment while working in a complex domain requiring deep understanding of vessel data, operational workflows, and maritime market concepts.</w:t>
       </w:r>
     </w:p>
     <w:p>
@@ -575,7 +575,7 @@
           <w:rFonts w:ascii="IBM Plex Sans" w:hAnsi="IBM Plex Sans"/>
           <w:b w:val="0"/>
           <w:i/>
-          <w:color w:val="4F5563"/>
+          <w:color w:val="5E6470"/>
           <w:sz w:val="21"/>
         </w:rPr>
         <w:t>Tech:</w:t>
@@ -585,7 +585,7 @@
           <w:rFonts w:ascii="IBM Plex Sans" w:hAnsi="IBM Plex Sans"/>
           <w:b w:val="0"/>
           <w:i w:val="0"/>
-          <w:color w:val="4F5563"/>
+          <w:color w:val="5E6470"/>
           <w:sz w:val="21"/>
         </w:rPr>
         <w:t xml:space="preserve"> React, TypeScript, MobX, OpenLayers, Node.js, Azure DevOps, C#, REST APIs</w:t>
@@ -631,8 +631,8 @@
                 <w:rFonts w:ascii="IBM Plex Sans" w:hAnsi="IBM Plex Sans"/>
                 <w:b/>
                 <w:i w:val="0"/>
-                <w:color w:val="000000"/>
-                <w:sz w:val="21"/>
+                <w:color w:val="222222"/>
+                <w:sz w:val="24"/>
               </w:rPr>
               <w:t>Frontend Tech Lead | Bally’s Interactive | London, UK</w:t>
             </w:r>
@@ -658,8 +658,8 @@
                 <w:rFonts w:ascii="IBM Plex Sans" w:hAnsi="IBM Plex Sans"/>
                 <w:b w:val="0"/>
                 <w:i w:val="0"/>
-                <w:color w:val="000000"/>
-                <w:sz w:val="21"/>
+                <w:color w:val="222222"/>
+                <w:sz w:val="20"/>
               </w:rPr>
               <w:t>11/2022 – 11/2023</w:t>
             </w:r>
@@ -676,8 +676,8 @@
           <w:rFonts w:ascii="IBM Plex Sans" w:hAnsi="IBM Plex Sans"/>
           <w:b w:val="0"/>
           <w:i w:val="0"/>
-          <w:color w:val="000000"/>
-          <w:sz w:val="21"/>
+          <w:color w:val="222222"/>
+          <w:sz w:val="22"/>
         </w:rPr>
         <w:t>Led frontend delivery and workflow improvements for cross-functional product initiatives, collaborating with architects, backend teams, and frontend engineers to improve delivery quality and release reliability across multiple projects.</w:t>
       </w:r>
@@ -692,8 +692,8 @@
           <w:rFonts w:ascii="IBM Plex Sans" w:hAnsi="IBM Plex Sans"/>
           <w:b w:val="0"/>
           <w:i w:val="0"/>
-          <w:color w:val="000000"/>
-          <w:sz w:val="21"/>
+          <w:color w:val="222222"/>
+          <w:sz w:val="22"/>
         </w:rPr>
         <w:t>Improved deployment reliability and feedback cycles by introducing Pull Request automation, static analysis, and CI quality gates across 29 frontend repositories using GitHub Actions and SonarQube.</w:t>
       </w:r>
@@ -708,8 +708,8 @@
           <w:rFonts w:ascii="IBM Plex Sans" w:hAnsi="IBM Plex Sans"/>
           <w:b w:val="0"/>
           <w:i w:val="0"/>
-          <w:color w:val="000000"/>
-          <w:sz w:val="21"/>
+          <w:color w:val="222222"/>
+          <w:sz w:val="22"/>
         </w:rPr>
         <w:t>Coordinated cross-functional frontend initiatives involving React, Svelte, and shared platform tooling across multiple teams and delivery streams.</w:t>
       </w:r>
@@ -724,8 +724,8 @@
           <w:rFonts w:ascii="IBM Plex Sans" w:hAnsi="IBM Plex Sans"/>
           <w:b w:val="0"/>
           <w:i w:val="0"/>
-          <w:color w:val="000000"/>
-          <w:sz w:val="21"/>
+          <w:color w:val="222222"/>
+          <w:sz w:val="22"/>
         </w:rPr>
         <w:t>Led onboarding and documentation modernization efforts, creating dependency maps, architectural diagrams, and structured guidance that improved developer self-sufficiency and reduced reliance on tribal knowledge.</w:t>
       </w:r>
@@ -740,8 +740,8 @@
           <w:rFonts w:ascii="IBM Plex Sans" w:hAnsi="IBM Plex Sans"/>
           <w:b w:val="0"/>
           <w:i w:val="0"/>
-          <w:color w:val="000000"/>
-          <w:sz w:val="21"/>
+          <w:color w:val="222222"/>
+          <w:sz w:val="22"/>
         </w:rPr>
         <w:t>Helped shape frontend modernization initiatives through roadmap planning, architecture discussions, platform tooling improvements, and delivery coordination across multiple teams.</w:t>
       </w:r>
@@ -756,8 +756,8 @@
           <w:rFonts w:ascii="IBM Plex Sans" w:hAnsi="IBM Plex Sans"/>
           <w:b w:val="0"/>
           <w:i w:val="0"/>
-          <w:color w:val="000000"/>
-          <w:sz w:val="21"/>
+          <w:color w:val="222222"/>
+          <w:sz w:val="22"/>
         </w:rPr>
         <w:t>Reduced operational friction and improved deployment reliability by standardising development practices, strengthening onboarding flows, and simplifying frontend maintenance.</w:t>
       </w:r>
@@ -771,7 +771,7 @@
           <w:rFonts w:ascii="IBM Plex Sans" w:hAnsi="IBM Plex Sans"/>
           <w:b w:val="0"/>
           <w:i/>
-          <w:color w:val="4F5563"/>
+          <w:color w:val="5E6470"/>
           <w:sz w:val="21"/>
         </w:rPr>
         <w:t>Tech:</w:t>
@@ -781,7 +781,7 @@
           <w:rFonts w:ascii="IBM Plex Sans" w:hAnsi="IBM Plex Sans"/>
           <w:b w:val="0"/>
           <w:i w:val="0"/>
-          <w:color w:val="4F5563"/>
+          <w:color w:val="5E6470"/>
           <w:sz w:val="21"/>
         </w:rPr>
         <w:t xml:space="preserve"> React, TypeScript, Svelte, Redux, Nx, GitHub Actions, Jenkins, WebDriverIO, Cypress, OpenStack</w:t>
@@ -827,8 +827,8 @@
                 <w:rFonts w:ascii="IBM Plex Sans" w:hAnsi="IBM Plex Sans"/>
                 <w:b/>
                 <w:i w:val="0"/>
-                <w:color w:val="000000"/>
-                <w:sz w:val="21"/>
+                <w:color w:val="222222"/>
+                <w:sz w:val="24"/>
               </w:rPr>
               <w:t>Senior Frontend Engineer | Gamesys / Bally’s Interactive | London, UK</w:t>
             </w:r>
@@ -854,8 +854,8 @@
                 <w:rFonts w:ascii="IBM Plex Sans" w:hAnsi="IBM Plex Sans"/>
                 <w:b w:val="0"/>
                 <w:i w:val="0"/>
-                <w:color w:val="000000"/>
-                <w:sz w:val="21"/>
+                <w:color w:val="222222"/>
+                <w:sz w:val="20"/>
               </w:rPr>
               <w:t>10/2020 – 11/2022</w:t>
             </w:r>
@@ -872,8 +872,8 @@
           <w:rFonts w:ascii="IBM Plex Sans" w:hAnsi="IBM Plex Sans"/>
           <w:b w:val="0"/>
           <w:i w:val="0"/>
-          <w:color w:val="000000"/>
-          <w:sz w:val="21"/>
+          <w:color w:val="222222"/>
+          <w:sz w:val="22"/>
         </w:rPr>
         <w:t>Worked across frontend platforms, workflow tooling, and internal delivery systems to improve engineering efficiency, onboarding quality, and cross-team collaboration for promotional and content-delivery products.</w:t>
       </w:r>
@@ -888,8 +888,8 @@
           <w:rFonts w:ascii="IBM Plex Sans" w:hAnsi="IBM Plex Sans"/>
           <w:b w:val="0"/>
           <w:i w:val="0"/>
-          <w:color w:val="000000"/>
-          <w:sz w:val="21"/>
+          <w:color w:val="222222"/>
+          <w:sz w:val="22"/>
         </w:rPr>
         <w:t>Identified an operational bottleneck and delivered a Node.js CLI tool integrating with the Jira REST API to automate offer-content production, reducing lead time from 2–3 days to about 15 minutes.</w:t>
       </w:r>
@@ -904,8 +904,8 @@
           <w:rFonts w:ascii="IBM Plex Sans" w:hAnsi="IBM Plex Sans"/>
           <w:b w:val="0"/>
           <w:i w:val="0"/>
-          <w:color w:val="000000"/>
-          <w:sz w:val="21"/>
+          <w:color w:val="222222"/>
+          <w:sz w:val="22"/>
         </w:rPr>
         <w:t>Modernised legacy internal tooling by defining new data contracts and integrating with the GitHub REST API to improve content browsing, preview, and production testing.</w:t>
       </w:r>
@@ -920,8 +920,8 @@
           <w:rFonts w:ascii="IBM Plex Sans" w:hAnsi="IBM Plex Sans"/>
           <w:b w:val="0"/>
           <w:i w:val="0"/>
-          <w:color w:val="000000"/>
-          <w:sz w:val="21"/>
+          <w:color w:val="222222"/>
+          <w:sz w:val="22"/>
         </w:rPr>
         <w:t>Reduced coordination overhead and delivery friction by building internal tooling and deployment workflows that simplified release processes across engineering and content teams.</w:t>
       </w:r>
@@ -936,8 +936,8 @@
           <w:rFonts w:ascii="IBM Plex Sans" w:hAnsi="IBM Plex Sans"/>
           <w:b w:val="0"/>
           <w:i w:val="0"/>
-          <w:color w:val="000000"/>
-          <w:sz w:val="21"/>
+          <w:color w:val="222222"/>
+          <w:sz w:val="22"/>
         </w:rPr>
         <w:t>Created onboarding resources, architectural diagrams, and dependency maps that improved team self-sufficiency and reduced onboarding friction.</w:t>
       </w:r>
@@ -952,8 +952,8 @@
           <w:rFonts w:ascii="IBM Plex Sans" w:hAnsi="IBM Plex Sans"/>
           <w:b w:val="0"/>
           <w:i w:val="0"/>
-          <w:color w:val="000000"/>
-          <w:sz w:val="21"/>
+          <w:color w:val="222222"/>
+          <w:sz w:val="22"/>
         </w:rPr>
         <w:t>Improved team effectiveness through mentoring, code pairing, testing practices, production troubleshooting, and knowledge sharing across frontend teams.</w:t>
       </w:r>
@@ -968,8 +968,8 @@
           <w:rFonts w:ascii="IBM Plex Sans" w:hAnsi="IBM Plex Sans"/>
           <w:b w:val="0"/>
           <w:i w:val="0"/>
-          <w:color w:val="000000"/>
-          <w:sz w:val="21"/>
+          <w:color w:val="222222"/>
+          <w:sz w:val="22"/>
         </w:rPr>
         <w:t>Contributed to initiatives focused on reducing maintenance overhead, improving deployment stability, and modernising internal engineering practices.</w:t>
       </w:r>
@@ -983,7 +983,7 @@
           <w:rFonts w:ascii="IBM Plex Sans" w:hAnsi="IBM Plex Sans"/>
           <w:b w:val="0"/>
           <w:i/>
-          <w:color w:val="4F5563"/>
+          <w:color w:val="5E6470"/>
           <w:sz w:val="21"/>
         </w:rPr>
         <w:t>Tech:</w:t>
@@ -993,7 +993,7 @@
           <w:rFonts w:ascii="IBM Plex Sans" w:hAnsi="IBM Plex Sans"/>
           <w:b w:val="0"/>
           <w:i w:val="0"/>
-          <w:color w:val="4F5563"/>
+          <w:color w:val="5E6470"/>
           <w:sz w:val="21"/>
         </w:rPr>
         <w:t xml:space="preserve"> React, JavaScript, Node.js, Redux, Svelte, Webpack, GitHub Actions, Jenkins, REST APIs</w:t>
@@ -1039,8 +1039,8 @@
                 <w:rFonts w:ascii="IBM Plex Sans" w:hAnsi="IBM Plex Sans"/>
                 <w:b/>
                 <w:i w:val="0"/>
-                <w:color w:val="000000"/>
-                <w:sz w:val="21"/>
+                <w:color w:val="222222"/>
+                <w:sz w:val="24"/>
               </w:rPr>
               <w:t>Frontend Developer | Gamesys | London, UK</w:t>
             </w:r>
@@ -1066,8 +1066,8 @@
                 <w:rFonts w:ascii="IBM Plex Sans" w:hAnsi="IBM Plex Sans"/>
                 <w:b w:val="0"/>
                 <w:i w:val="0"/>
-                <w:color w:val="000000"/>
-                <w:sz w:val="21"/>
+                <w:color w:val="222222"/>
+                <w:sz w:val="20"/>
               </w:rPr>
               <w:t>03/2019 – 09/2020</w:t>
             </w:r>
@@ -1084,8 +1084,8 @@
           <w:rFonts w:ascii="IBM Plex Sans" w:hAnsi="IBM Plex Sans"/>
           <w:b w:val="0"/>
           <w:i w:val="0"/>
-          <w:color w:val="000000"/>
-          <w:sz w:val="21"/>
+          <w:color w:val="222222"/>
+          <w:sz w:val="22"/>
         </w:rPr>
         <w:t>Developed frontend features and internal workflow tooling for promotional and content-delivery systems used across high-volume product operations.</w:t>
       </w:r>
@@ -1100,8 +1100,8 @@
           <w:rFonts w:ascii="IBM Plex Sans" w:hAnsi="IBM Plex Sans"/>
           <w:b w:val="0"/>
           <w:i w:val="0"/>
-          <w:color w:val="000000"/>
-          <w:sz w:val="21"/>
+          <w:color w:val="222222"/>
+          <w:sz w:val="22"/>
         </w:rPr>
         <w:t>Built a reusable Sass-based micro design system that improved UI consistency and accelerated promotional content delivery workflows.</w:t>
       </w:r>
@@ -1116,8 +1116,8 @@
           <w:rFonts w:ascii="IBM Plex Sans" w:hAnsi="IBM Plex Sans"/>
           <w:b w:val="0"/>
           <w:i w:val="0"/>
-          <w:color w:val="000000"/>
-          <w:sz w:val="21"/>
+          <w:color w:val="222222"/>
+          <w:sz w:val="22"/>
         </w:rPr>
         <w:t>Designed and developed deployment-visibility tooling integrating with the GitHub REST API to improve operational transparency and reduce troubleshooting overhead.</w:t>
       </w:r>
@@ -1132,8 +1132,8 @@
           <w:rFonts w:ascii="IBM Plex Sans" w:hAnsi="IBM Plex Sans"/>
           <w:b w:val="0"/>
           <w:i w:val="0"/>
-          <w:color w:val="000000"/>
-          <w:sz w:val="21"/>
+          <w:color w:val="222222"/>
+          <w:sz w:val="22"/>
         </w:rPr>
         <w:t>Engineered a reusable Node.js wrapper around the GitHub REST API that enabled zero-clone Git operations and reduced deployment-processing time.</w:t>
       </w:r>
@@ -1148,8 +1148,8 @@
           <w:rFonts w:ascii="IBM Plex Sans" w:hAnsi="IBM Plex Sans"/>
           <w:b w:val="0"/>
           <w:i w:val="0"/>
-          <w:color w:val="000000"/>
-          <w:sz w:val="21"/>
+          <w:color w:val="222222"/>
+          <w:sz w:val="22"/>
         </w:rPr>
         <w:t>Contributed to frontend application development using React and Redux while supporting shared tooling, deployment workflows, and maintainability improvements across content-delivery systems.</w:t>
       </w:r>
@@ -1163,7 +1163,7 @@
           <w:rFonts w:ascii="IBM Plex Sans" w:hAnsi="IBM Plex Sans"/>
           <w:b w:val="0"/>
           <w:i/>
-          <w:color w:val="4F5563"/>
+          <w:color w:val="5E6470"/>
           <w:sz w:val="21"/>
         </w:rPr>
         <w:t>Tech:</w:t>
@@ -1173,7 +1173,7 @@
           <w:rFonts w:ascii="IBM Plex Sans" w:hAnsi="IBM Plex Sans"/>
           <w:b w:val="0"/>
           <w:i w:val="0"/>
-          <w:color w:val="4F5563"/>
+          <w:color w:val="5E6470"/>
           <w:sz w:val="21"/>
         </w:rPr>
         <w:t xml:space="preserve"> React, JavaScript, Redux, Sass, Webpack, Gulp, Jenkins</w:t>
@@ -1219,8 +1219,8 @@
                 <w:rFonts w:ascii="IBM Plex Sans" w:hAnsi="IBM Plex Sans"/>
                 <w:b/>
                 <w:i w:val="0"/>
-                <w:color w:val="000000"/>
-                <w:sz w:val="21"/>
+                <w:color w:val="222222"/>
+                <w:sz w:val="24"/>
               </w:rPr>
               <w:t>Co-founder &amp; Frontend Developer | UNBOX Learning Experience | Curitiba, Brazil</w:t>
             </w:r>
@@ -1246,8 +1246,8 @@
                 <w:rFonts w:ascii="IBM Plex Sans" w:hAnsi="IBM Plex Sans"/>
                 <w:b w:val="0"/>
                 <w:i w:val="0"/>
-                <w:color w:val="000000"/>
-                <w:sz w:val="21"/>
+                <w:color w:val="222222"/>
+                <w:sz w:val="20"/>
               </w:rPr>
               <w:t>2009 – 2017</w:t>
             </w:r>
@@ -1264,8 +1264,8 @@
           <w:rFonts w:ascii="IBM Plex Sans" w:hAnsi="IBM Plex Sans"/>
           <w:b w:val="0"/>
           <w:i w:val="0"/>
-          <w:color w:val="000000"/>
-          <w:sz w:val="21"/>
+          <w:color w:val="222222"/>
+          <w:sz w:val="22"/>
         </w:rPr>
         <w:t>Co-developed browser-based e-learning platforms and interactive educational products for client projects, focusing on frontend development, user experience, and collaborative delivery.</w:t>
       </w:r>
@@ -1280,8 +1280,8 @@
           <w:rFonts w:ascii="IBM Plex Sans" w:hAnsi="IBM Plex Sans"/>
           <w:b w:val="0"/>
           <w:i w:val="0"/>
-          <w:color w:val="000000"/>
-          <w:sz w:val="21"/>
+          <w:color w:val="222222"/>
+          <w:sz w:val="22"/>
         </w:rPr>
         <w:t>Built and maintained browser-based learning platforms and interactive educational experiences using JavaScript, HTML, CSS, and ActionScript.</w:t>
       </w:r>
@@ -1296,8 +1296,8 @@
           <w:rFonts w:ascii="IBM Plex Sans" w:hAnsi="IBM Plex Sans"/>
           <w:b w:val="0"/>
           <w:i w:val="0"/>
-          <w:color w:val="000000"/>
-          <w:sz w:val="21"/>
+          <w:color w:val="222222"/>
+          <w:sz w:val="22"/>
         </w:rPr>
         <w:t>Developed frontend interfaces and custom LMS functionality supporting content delivery, interactive learning workflows, and user engagement.</w:t>
       </w:r>
@@ -1312,8 +1312,8 @@
           <w:rFonts w:ascii="IBM Plex Sans" w:hAnsi="IBM Plex Sans"/>
           <w:b w:val="0"/>
           <w:i w:val="0"/>
-          <w:color w:val="000000"/>
-          <w:sz w:val="21"/>
+          <w:color w:val="222222"/>
+          <w:sz w:val="22"/>
         </w:rPr>
         <w:t>Managed and customised Moodle-based learning environments across multiple client projects.</w:t>
       </w:r>
@@ -1328,8 +1328,8 @@
           <w:rFonts w:ascii="IBM Plex Sans" w:hAnsi="IBM Plex Sans"/>
           <w:b w:val="0"/>
           <w:i w:val="0"/>
-          <w:color w:val="000000"/>
-          <w:sz w:val="21"/>
+          <w:color w:val="222222"/>
+          <w:sz w:val="22"/>
         </w:rPr>
         <w:t>Worked across frontend implementation, client collaboration, deployment coordination, and product customisation within collaborative delivery teams.</w:t>
       </w:r>
@@ -1343,7 +1343,7 @@
           <w:rFonts w:ascii="IBM Plex Sans" w:hAnsi="IBM Plex Sans"/>
           <w:b w:val="0"/>
           <w:i/>
-          <w:color w:val="4F5563"/>
+          <w:color w:val="5E6470"/>
           <w:sz w:val="21"/>
         </w:rPr>
         <w:t>Tech:</w:t>
@@ -1353,7 +1353,7 @@
           <w:rFonts w:ascii="IBM Plex Sans" w:hAnsi="IBM Plex Sans"/>
           <w:b w:val="0"/>
           <w:i w:val="0"/>
-          <w:color w:val="4F5563"/>
+          <w:color w:val="5E6470"/>
           <w:sz w:val="21"/>
         </w:rPr>
         <w:t xml:space="preserve"> JavaScript, HTML, CSS, Sass, ActionScript, Moodle LMS, AWS EC2, Linux</w:t>
@@ -1365,7 +1365,7 @@
         <w:spacing w:before="240" w:after="100" w:lineRule="auto" w:line="240"/>
         <w:keepNext/>
         <w:pBdr>
-          <w:bottom w:val="single" w:sz="8" w:space="1" w:color="BFC6D1"/>
+          <w:bottom w:val="single" w:sz="8" w:space="1" w:color="C9D2DF"/>
         </w:pBdr>
       </w:pPr>
       <w:r>
@@ -1373,8 +1373,8 @@
           <w:rFonts w:ascii="IBM Plex Sans" w:hAnsi="IBM Plex Sans"/>
           <w:b/>
           <w:i w:val="0"/>
-          <w:color w:val="1F3A5F"/>
-          <w:sz w:val="25"/>
+          <w:color w:val="2F5FA7"/>
+          <w:sz w:val="26"/>
         </w:rPr>
         <w:t>SELECTED PROJECT</w:t>
       </w:r>
@@ -1419,8 +1419,8 @@
                 <w:rFonts w:ascii="IBM Plex Sans" w:hAnsi="IBM Plex Sans"/>
                 <w:b/>
                 <w:i w:val="0"/>
-                <w:color w:val="000000"/>
-                <w:sz w:val="21"/>
+                <w:color w:val="222222"/>
+                <w:sz w:val="24"/>
               </w:rPr>
               <w:t>Alfred (iOS Product Engineering Project)</w:t>
             </w:r>
@@ -1446,8 +1446,8 @@
                 <w:rFonts w:ascii="IBM Plex Sans" w:hAnsi="IBM Plex Sans"/>
                 <w:b w:val="0"/>
                 <w:i w:val="0"/>
-                <w:color w:val="000000"/>
-                <w:sz w:val="21"/>
+                <w:color w:val="222222"/>
+                <w:sz w:val="20"/>
               </w:rPr>
               <w:t>2025 – Present</w:t>
             </w:r>
@@ -1464,8 +1464,8 @@
           <w:rFonts w:ascii="IBM Plex Sans" w:hAnsi="IBM Plex Sans"/>
           <w:b w:val="0"/>
           <w:i w:val="0"/>
-          <w:color w:val="000000"/>
-          <w:sz w:val="21"/>
+          <w:color w:val="222222"/>
+          <w:sz w:val="22"/>
         </w:rPr>
         <w:t>SwiftUI-based product engineering project built to explore modern mobile architecture, AI-assisted development workflows, onboarding experiences, and maintainable application design.</w:t>
       </w:r>
@@ -1480,8 +1480,8 @@
           <w:rFonts w:ascii="IBM Plex Sans" w:hAnsi="IBM Plex Sans"/>
           <w:b w:val="0"/>
           <w:i w:val="0"/>
-          <w:color w:val="000000"/>
-          <w:sz w:val="21"/>
+          <w:color w:val="222222"/>
+          <w:sz w:val="22"/>
         </w:rPr>
         <w:t>Built product flows covering onboarding, recommendation handling, notifications, async refresh logic, and session-aware navigation.</w:t>
       </w:r>
@@ -1496,8 +1496,8 @@
           <w:rFonts w:ascii="IBM Plex Sans" w:hAnsi="IBM Plex Sans"/>
           <w:b w:val="0"/>
           <w:i w:val="0"/>
-          <w:color w:val="000000"/>
-          <w:sz w:val="21"/>
+          <w:color w:val="222222"/>
+          <w:sz w:val="22"/>
         </w:rPr>
         <w:t>Used AI-assisted development workflows to accelerate implementation while maintaining review, testing, and verification standards.</w:t>
       </w:r>
@@ -1512,8 +1512,8 @@
           <w:rFonts w:ascii="IBM Plex Sans" w:hAnsi="IBM Plex Sans"/>
           <w:b w:val="0"/>
           <w:i w:val="0"/>
-          <w:color w:val="000000"/>
-          <w:sz w:val="21"/>
+          <w:color w:val="222222"/>
+          <w:sz w:val="22"/>
         </w:rPr>
         <w:t>Developed testing and verification practices supporting maintainable implementation and collaborative iteration.</w:t>
       </w:r>
@@ -1528,8 +1528,8 @@
           <w:rFonts w:ascii="IBM Plex Sans" w:hAnsi="IBM Plex Sans"/>
           <w:b w:val="0"/>
           <w:i w:val="0"/>
-          <w:color w:val="000000"/>
-          <w:sz w:val="21"/>
+          <w:color w:val="222222"/>
+          <w:sz w:val="22"/>
         </w:rPr>
         <w:t>Built as an end-to-end product engineering exercise covering product flows, API integration, state management, testing practices, and collaborative frontend/backend delivery.</w:t>
       </w:r>
@@ -1543,7 +1543,7 @@
           <w:rFonts w:ascii="IBM Plex Sans" w:hAnsi="IBM Plex Sans"/>
           <w:b w:val="0"/>
           <w:i/>
-          <w:color w:val="4F5563"/>
+          <w:color w:val="5E6470"/>
           <w:sz w:val="21"/>
         </w:rPr>
         <w:t>Tech:</w:t>
@@ -1553,7 +1553,7 @@
           <w:rFonts w:ascii="IBM Plex Sans" w:hAnsi="IBM Plex Sans"/>
           <w:b w:val="0"/>
           <w:i w:val="0"/>
-          <w:color w:val="4F5563"/>
+          <w:color w:val="5E6470"/>
           <w:sz w:val="21"/>
         </w:rPr>
         <w:t xml:space="preserve"> SwiftUI, Swift, REST APIs, Firebase, SignalR, XcodeGen, Testing, Workflow Automation</w:t>
@@ -1565,7 +1565,7 @@
         <w:spacing w:before="240" w:after="100" w:lineRule="auto" w:line="240"/>
         <w:keepNext/>
         <w:pBdr>
-          <w:bottom w:val="single" w:sz="8" w:space="1" w:color="BFC6D1"/>
+          <w:bottom w:val="single" w:sz="8" w:space="1" w:color="C9D2DF"/>
         </w:pBdr>
       </w:pPr>
       <w:r>
@@ -1573,8 +1573,8 @@
           <w:rFonts w:ascii="IBM Plex Sans" w:hAnsi="IBM Plex Sans"/>
           <w:b/>
           <w:i w:val="0"/>
-          <w:color w:val="1F3A5F"/>
-          <w:sz w:val="25"/>
+          <w:color w:val="2F5FA7"/>
+          <w:sz w:val="26"/>
         </w:rPr>
         <w:t>EDUCATION</w:t>
       </w:r>
@@ -1618,8 +1618,8 @@
                 <w:rFonts w:ascii="IBM Plex Sans" w:hAnsi="IBM Plex Sans"/>
                 <w:b/>
                 <w:i w:val="0"/>
-                <w:color w:val="000000"/>
-                <w:sz w:val="21"/>
+                <w:color w:val="222222"/>
+                <w:sz w:val="24"/>
               </w:rPr>
               <w:t>Computer Engineering</w:t>
             </w:r>
@@ -1645,8 +1645,8 @@
                 <w:rFonts w:ascii="IBM Plex Sans" w:hAnsi="IBM Plex Sans"/>
                 <w:b w:val="0"/>
                 <w:i w:val="0"/>
-                <w:color w:val="000000"/>
-                <w:sz w:val="21"/>
+                <w:color w:val="222222"/>
+                <w:sz w:val="20"/>
               </w:rPr>
               <w:t>2005 – 2010</w:t>
             </w:r>
@@ -1663,8 +1663,8 @@
           <w:rFonts w:ascii="IBM Plex Sans" w:hAnsi="IBM Plex Sans"/>
           <w:b w:val="0"/>
           <w:i w:val="0"/>
-          <w:color w:val="000000"/>
-          <w:sz w:val="21"/>
+          <w:color w:val="222222"/>
+          <w:sz w:val="22"/>
         </w:rPr>
         <w:t>Positivo University, Brazil</w:t>
       </w:r>
@@ -1708,8 +1708,8 @@
                 <w:rFonts w:ascii="IBM Plex Sans" w:hAnsi="IBM Plex Sans"/>
                 <w:b/>
                 <w:i w:val="0"/>
-                <w:color w:val="000000"/>
-                <w:sz w:val="21"/>
+                <w:color w:val="222222"/>
+                <w:sz w:val="24"/>
               </w:rPr>
               <w:t>Electronics</w:t>
             </w:r>
@@ -1735,8 +1735,8 @@
                 <w:rFonts w:ascii="IBM Plex Sans" w:hAnsi="IBM Plex Sans"/>
                 <w:b w:val="0"/>
                 <w:i w:val="0"/>
-                <w:color w:val="000000"/>
-                <w:sz w:val="21"/>
+                <w:color w:val="222222"/>
+                <w:sz w:val="20"/>
               </w:rPr>
               <w:t>1997 – 2000</w:t>
             </w:r>
@@ -1753,8 +1753,8 @@
           <w:rFonts w:ascii="IBM Plex Sans" w:hAnsi="IBM Plex Sans"/>
           <w:b w:val="0"/>
           <w:i w:val="0"/>
-          <w:color w:val="000000"/>
-          <w:sz w:val="21"/>
+          <w:color w:val="222222"/>
+          <w:sz w:val="22"/>
         </w:rPr>
         <w:t>Federal University of Technology (UTFPR), Brazil</w:t>
       </w:r>
@@ -2140,8 +2140,8 @@
       <w:rFonts w:ascii="IBM Plex Sans" w:hAnsi="IBM Plex Sans"/>
       <w:b w:val="0"/>
       <w:i w:val="0"/>
-      <w:color w:val="000000"/>
-      <w:sz w:val="21"/>
+      <w:color w:val="222222"/>
+      <w:sz w:val="22"/>
     </w:rPr>
   </w:style>
   <w:style w:type="paragraph" w:styleId="Header">
@@ -2208,8 +2208,8 @@
       <w:b/>
       <w:bCs/>
       <w:i w:val="0"/>
-      <w:color w:val="1F3A5F"/>
-      <w:sz w:val="25"/>
+      <w:color w:val="2F5FA7"/>
+      <w:sz w:val="26"/>
       <w:szCs w:val="28"/>
     </w:rPr>
   </w:style>
@@ -2234,8 +2234,8 @@
       <w:b/>
       <w:bCs/>
       <w:i w:val="0"/>
-      <w:color w:val="000000"/>
-      <w:sz w:val="21"/>
+      <w:color w:val="222222"/>
+      <w:sz w:val="22"/>
       <w:szCs w:val="26"/>
     </w:rPr>
   </w:style>
@@ -2260,8 +2260,8 @@
       <w:b/>
       <w:bCs/>
       <w:i w:val="0"/>
-      <w:color w:val="1F3A5F"/>
-      <w:sz w:val="21"/>
+      <w:color w:val="2F5FA7"/>
+      <w:sz w:val="22"/>
     </w:rPr>
   </w:style>
   <w:style w:type="paragraph" w:styleId="Heading4">
@@ -2503,10 +2503,10 @@
       <w:rFonts w:asciiTheme="majorHAnsi" w:eastAsiaTheme="majorEastAsia" w:hAnsiTheme="majorHAnsi" w:cstheme="majorBidi" w:ascii="IBM Plex Sans" w:hAnsi="IBM Plex Sans"/>
       <w:b/>
       <w:i w:val="0"/>
-      <w:color w:val="10243D"/>
+      <w:color w:val="2F5FA7"/>
       <w:spacing w:val="5"/>
       <w:kern w:val="28"/>
-      <w:sz w:val="46"/>
+      <w:sz w:val="54"/>
       <w:szCs w:val="52"/>
     </w:rPr>
   </w:style>
@@ -2545,9 +2545,9 @@
       <w:b/>
       <w:i w:val="0"/>
       <w:iCs/>
-      <w:color w:val="1F3A5F"/>
+      <w:color w:val="2F5FA7"/>
       <w:spacing w:val="15"/>
-      <w:sz w:val="27"/>
+      <w:sz w:val="32"/>
       <w:szCs w:val="24"/>
     </w:rPr>
   </w:style>
@@ -2692,8 +2692,8 @@
       <w:rFonts w:ascii="IBM Plex Sans" w:hAnsi="IBM Plex Sans"/>
       <w:b w:val="0"/>
       <w:i w:val="0"/>
-      <w:color w:val="000000"/>
-      <w:sz w:val="21"/>
+      <w:color w:val="222222"/>
+      <w:sz w:val="22"/>
     </w:rPr>
   </w:style>
   <w:style w:type="paragraph" w:styleId="ListBullet2">

</xml_diff>

<commit_message>
Add YAML front matter resume metadata support
</commit_message>
<xml_diff>
--- a/docs/my-resume.docx
+++ b/docs/my-resume.docx
@@ -56,6 +56,36 @@
     </w:p>
     <w:p>
       <w:pPr>
+        <w:spacing w:before="0" w:after="0" w:lineRule="auto" w:line="240"/>
+      </w:pPr>
+      <w:r>
+        <w:rPr>
+          <w:rFonts w:ascii="IBM Plex Sans" w:hAnsi="IBM Plex Sans"/>
+          <w:b w:val="0"/>
+          <w:i w:val="0"/>
+          <w:color w:val="5E6470"/>
+          <w:sz w:val="21"/>
+        </w:rPr>
+        <w:t>Hove, United Kingdom</w:t>
+      </w:r>
+    </w:p>
+    <w:p>
+      <w:pPr>
+        <w:spacing w:before="0" w:after="0" w:lineRule="auto" w:line="240"/>
+      </w:pPr>
+      <w:r>
+        <w:rPr>
+          <w:rFonts w:ascii="IBM Plex Sans" w:hAnsi="IBM Plex Sans"/>
+          <w:b w:val="0"/>
+          <w:i w:val="0"/>
+          <w:color w:val="5E6470"/>
+          <w:sz w:val="21"/>
+        </w:rPr>
+        <w:t>davi.naizer@gmail.com | linkedin.com/in/davi-naizer</w:t>
+      </w:r>
+    </w:p>
+    <w:p>
+      <w:pPr>
         <w:spacing w:before="0" w:after="140" w:lineRule="auto" w:line="240"/>
       </w:pPr>
       <w:r>
@@ -66,7 +96,7 @@
           <w:color w:val="5E6470"/>
           <w:sz w:val="21"/>
         </w:rPr>
-        <w:t>Hove, United Kingdom | davi.naizer@gmail.com | LinkedIn: linkedin.com/in/davi-naizer | Languages: English (C1), Portuguese</w:t>
+        <w:t>English (C1), Portuguese</w:t>
       </w:r>
     </w:p>
     <w:p>

</xml_diff>

<commit_message>
docs: updates the resume to use a more natural language
</commit_message>
<xml_diff>
--- a/docs/my-resume.docx
+++ b/docs/my-resume.docx
@@ -131,7 +131,7 @@
           <w:color w:val="222222"/>
           <w:sz w:val="22"/>
         </w:rPr>
-        <w:t>Senior Frontend Engineer with 13+ years of experience delivering product-focused web applications across React, TypeScript, frontend architecture, and engineering workflow improvement.</w:t>
+        <w:t>Senior Frontend Engineer with 13+ years of experience building web applications with React, TypeScript and modern frontend technologies.</w:t>
       </w:r>
     </w:p>
     <w:p>
@@ -146,7 +146,7 @@
           <w:color w:val="222222"/>
           <w:sz w:val="22"/>
         </w:rPr>
-        <w:t>Experienced in identifying operational friction, improving delivery systems, and building user-facing products in collaboration with product, design, and backend teams. Recent work has included deployment automation across 29 repositories, internal tooling that reduced operational processes from days to minutes, and frontend systems supporting complex operational workflows and decision-making.</w:t>
+        <w:t>Most of my career has been spent in product teams, turning complex problems into maintainable software while making everyday work a little easier for both users and engineers. Alongside customer-facing features, I've built internal tools that reduced manual work, simplified onboarding, and made development and deployment more reliable.</w:t>
       </w:r>
     </w:p>
     <w:p>
@@ -161,7 +161,7 @@
           <w:color w:val="222222"/>
           <w:sz w:val="22"/>
         </w:rPr>
-        <w:t>Strongest areas include frontend product engineering, developer experience, workflow reliability, onboarding systems, and cross-functional delivery. Particularly interested in understanding user and operational problems, then building maintainable solutions that improve how people work while balancing engineering quality and sustainable delivery.</w:t>
+        <w:t>I enjoy understanding how people actually use software, spotting where things become unnecessarily difficult, and working with product, design and backend teams to simplify those workflows without making the codebase harder to maintain.</w:t>
       </w:r>
     </w:p>
     <w:p>
@@ -223,7 +223,7 @@
           <w:color w:val="2F5FA7"/>
           <w:sz w:val="22"/>
         </w:rPr>
-        <w:t>Product Engineering</w:t>
+        <w:t>Product Development</w:t>
       </w:r>
       <w:r>
         <w:rPr>
@@ -233,7 +233,7 @@
           <w:color w:val="222222"/>
           <w:sz w:val="22"/>
         </w:rPr>
-        <w:t>: Frontend Architecture, State Management, API Integration, UX Workflows, Accessibility, Cross-Functional Delivery</w:t>
+        <w:t>: Frontend Architecture, API Integration, State Management, UX, Accessibility, Design Systems</w:t>
       </w:r>
     </w:p>
     <w:p>
@@ -249,7 +249,7 @@
           <w:color w:val="2F5FA7"/>
           <w:sz w:val="22"/>
         </w:rPr>
-        <w:t>Testing &amp; Reliability</w:t>
+        <w:t>Quality &amp; Delivery</w:t>
       </w:r>
       <w:r>
         <w:rPr>
@@ -259,7 +259,7 @@
           <w:color w:val="222222"/>
           <w:sz w:val="22"/>
         </w:rPr>
-        <w:t>: Jest, React Testing Library, Cypress, Playwright, WebDriverIO, CI/CD, Observability</w:t>
+        <w:t>: Jest, React Testing Library, Cypress, Playwright, CI/CD, Observability</w:t>
       </w:r>
     </w:p>
     <w:p>
@@ -275,7 +275,7 @@
           <w:color w:val="2F5FA7"/>
           <w:sz w:val="22"/>
         </w:rPr>
-        <w:t>Workflow &amp; DX</w:t>
+        <w:t>Developer Experience</w:t>
       </w:r>
       <w:r>
         <w:rPr>
@@ -285,7 +285,7 @@
           <w:color w:val="222222"/>
           <w:sz w:val="22"/>
         </w:rPr>
-        <w:t>: GitHub Actions, Jenkins, Azure DevOps, Nx, Webpack, Developer Experience (DX), Process Automation</w:t>
+        <w:t>: GitHub Actions, Azure DevOps, Jenkins, Nx, Webpack, Process Automation</w:t>
       </w:r>
     </w:p>
     <w:p>
@@ -301,7 +301,7 @@
           <w:color w:val="2F5FA7"/>
           <w:sz w:val="22"/>
         </w:rPr>
-        <w:t>Supporting Technologies</w:t>
+        <w:t>Other</w:t>
       </w:r>
       <w:r>
         <w:rPr>
@@ -422,7 +422,7 @@
           <w:color w:val="222222"/>
           <w:sz w:val="22"/>
         </w:rPr>
-        <w:t>Structured sabbatical focused on technical modernization, sustainable work practices, and exploration of AI-assisted engineering workflows while continuing hands-on development across frontend and mobile technologies.</w:t>
+        <w:t>Took a planned career break after relocating to the UK to focus on professional development, experiment with AI-assisted software development, and build personal product projects while continuing hands-on development with SwiftUI, React and TypeScript.</w:t>
       </w:r>
     </w:p>
     <w:tbl>
@@ -513,7 +513,7 @@
           <w:color w:val="222222"/>
           <w:sz w:val="22"/>
         </w:rPr>
-        <w:t>Worked on the Signal Ocean platform, a maritime intelligence product used by charterers, brokers, operators, and analysts to monitor vessel activity, manage operational workflows, and make data-driven commercial decisions using large-scale shipping and market data.</w:t>
+        <w:t>Worked on Signal Ocean, a maritime intelligence platform used by brokers, operators and analysts to monitor vessel activity and support commercial decision-making.</w:t>
       </w:r>
     </w:p>
     <w:p>
@@ -529,7 +529,7 @@
           <w:color w:val="222222"/>
           <w:sz w:val="22"/>
         </w:rPr>
-        <w:t>Shipped and maintained frontend functionality for vessel-monitoring, analytics, and operational workflow experiences combining large-scale maritime datasets, interactive maps, and configurable user workspaces.</w:t>
+        <w:t>One recurring request was creating new vessel lists for users. I helped move that into a self-service workflow so they could manage it themselves.</w:t>
       </w:r>
     </w:p>
     <w:p>
@@ -545,7 +545,7 @@
           <w:color w:val="222222"/>
           <w:sz w:val="22"/>
         </w:rPr>
-        <w:t>Collaborated with backend engineers on metadata-driven vessel-list configuration workflows, enabling reusable templates and self-service customization across operational dashboards.</w:t>
+        <w:t>Worked closely with backend engineers to design a metadata-driven approach that made vessel list configuration reusable across different dashboards.</w:t>
       </w:r>
     </w:p>
     <w:p>
@@ -561,7 +561,7 @@
           <w:color w:val="222222"/>
           <w:sz w:val="22"/>
         </w:rPr>
-        <w:t>Delivered self-service configuration capabilities that enabled users to create and manage vessel-list templates without manual platform intervention, improving workflow flexibility and usability.</w:t>
+        <w:t>Owned the frontend implementation for vessel list workflows, covering API integration, shared state management and interactive map experiences.</w:t>
       </w:r>
     </w:p>
     <w:p>
@@ -577,7 +577,7 @@
           <w:color w:val="222222"/>
           <w:sz w:val="22"/>
         </w:rPr>
-        <w:t>Owned frontend implementation for vessel-list workflows spanning API integration, shared state management, and map-driven operational experiences within a maritime analytics platform.</w:t>
+        <w:t>Developed features across vessel monitoring, analytics and operational dashboards, working with large datasets and map-based interfaces.</w:t>
       </w:r>
     </w:p>
     <w:p>
@@ -593,7 +593,7 @@
           <w:color w:val="222222"/>
           <w:sz w:val="22"/>
         </w:rPr>
-        <w:t>Contributed to maintainable delivery practices within a cross-functional engineering environment while working in a complex domain requiring deep understanding of vessel data, operational workflows, and maritime market concepts.</w:t>
+        <w:t>Worked in a domain I knew very little about initially, learning the shipping industry quickly enough to contribute across product and engineering discussions.</w:t>
       </w:r>
     </w:p>
     <w:p>
@@ -709,7 +709,7 @@
           <w:color w:val="222222"/>
           <w:sz w:val="22"/>
         </w:rPr>
-        <w:t>Led frontend delivery and workflow improvements for cross-functional product initiatives, collaborating with architects, backend teams, and frontend engineers to improve delivery quality and release reliability across multiple projects.</w:t>
+        <w:t>My role gradually became less about building individual features and more about helping multiple frontend teams improve the way they worked, from onboarding and tooling to release processes.</w:t>
       </w:r>
     </w:p>
     <w:p>
@@ -725,7 +725,7 @@
           <w:color w:val="222222"/>
           <w:sz w:val="22"/>
         </w:rPr>
-        <w:t>Improved deployment reliability and feedback cycles by introducing Pull Request automation, static analysis, and CI quality gates across 29 frontend repositories using GitHub Actions and SonarQube.</w:t>
+        <w:t>Introduced Pull Request automation and CI quality gates across 29 frontend repositories, reducing manual work and making releases more consistent.</w:t>
       </w:r>
     </w:p>
     <w:p>
@@ -741,7 +741,7 @@
           <w:color w:val="222222"/>
           <w:sz w:val="22"/>
         </w:rPr>
-        <w:t>Coordinated cross-functional frontend initiatives involving React, Svelte, and shared platform tooling across multiple teams and delivery streams.</w:t>
+        <w:t>Worked with architects, backend engineers and frontend teams to improve shared tooling used across React projects.</w:t>
       </w:r>
     </w:p>
     <w:p>
@@ -757,7 +757,7 @@
           <w:color w:val="222222"/>
           <w:sz w:val="22"/>
         </w:rPr>
-        <w:t>Led onboarding and documentation modernization efforts, creating dependency maps, architectural diagrams, and structured guidance that improved developer self-sufficiency and reduced reliance on tribal knowledge.</w:t>
+        <w:t>Created architecture diagrams, dependency maps and onboarding guides that helped new engineers become productive more quickly.</w:t>
       </w:r>
     </w:p>
     <w:p>
@@ -773,7 +773,7 @@
           <w:color w:val="222222"/>
           <w:sz w:val="22"/>
         </w:rPr>
-        <w:t>Helped shape frontend modernization initiatives through roadmap planning, architecture discussions, platform tooling improvements, and delivery coordination across multiple teams.</w:t>
+        <w:t>Contributed to roadmap discussions and frontend platform improvements while balancing technical debt with ongoing product delivery.</w:t>
       </w:r>
     </w:p>
     <w:p>
@@ -789,7 +789,7 @@
           <w:color w:val="222222"/>
           <w:sz w:val="22"/>
         </w:rPr>
-        <w:t>Reduced operational friction and improved deployment reliability by standardising development practices, strengthening onboarding flows, and simplifying frontend maintenance.</w:t>
+        <w:t>Helped standardise development practices that made projects easier to maintain and reduced day-to-day friction for engineers.</w:t>
       </w:r>
     </w:p>
     <w:p>
@@ -905,7 +905,7 @@
           <w:color w:val="222222"/>
           <w:sz w:val="22"/>
         </w:rPr>
-        <w:t>Worked across frontend platforms, workflow tooling, and internal delivery systems to improve engineering efficiency, onboarding quality, and cross-team collaboration for promotional and content-delivery products.</w:t>
+        <w:t>Worked on both customer-facing products and the internal tools that supported them, with a growing focus on reducing manual work, improving onboarding, and making everyday engineering tasks easier.</w:t>
       </w:r>
     </w:p>
     <w:p>
@@ -921,7 +921,7 @@
           <w:color w:val="222222"/>
           <w:sz w:val="22"/>
         </w:rPr>
-        <w:t>Identified an operational bottleneck and delivered a Node.js CLI tool integrating with the Jira REST API to automate offer-content production, reducing lead time from 2–3 days to about 15 minutes.</w:t>
+        <w:t>Noticed a bottleneck in the promotional content workflow and built a Node.js tool around the Jira REST API that reduced turnaround time from 2-3 days to around 15 minutes.</w:t>
       </w:r>
     </w:p>
     <w:p>
@@ -937,7 +937,7 @@
           <w:color w:val="222222"/>
           <w:sz w:val="22"/>
         </w:rPr>
-        <w:t>Modernised legacy internal tooling by defining new data contracts and integrating with the GitHub REST API to improve content browsing, preview, and production testing.</w:t>
+        <w:t>Updated legacy internal tooling by redesigning data contracts and integrating with the GitHub REST API to improve content preview and testing.</w:t>
       </w:r>
     </w:p>
     <w:p>
@@ -953,7 +953,7 @@
           <w:color w:val="222222"/>
           <w:sz w:val="22"/>
         </w:rPr>
-        <w:t>Reduced coordination overhead and delivery friction by building internal tooling and deployment workflows that simplified release processes across engineering and content teams.</w:t>
+        <w:t>Built internal tools and deployment workflows that removed repetitive manual work for both engineering and content teams.</w:t>
       </w:r>
     </w:p>
     <w:p>
@@ -985,7 +985,7 @@
           <w:color w:val="222222"/>
           <w:sz w:val="22"/>
         </w:rPr>
-        <w:t>Improved team effectiveness through mentoring, code pairing, testing practices, production troubleshooting, and knowledge sharing across frontend teams.</w:t>
+        <w:t>Supported the team through mentoring, code reviews, production troubleshooting and day-to-day technical collaboration.</w:t>
       </w:r>
     </w:p>
     <w:p>
@@ -1001,7 +1001,7 @@
           <w:color w:val="222222"/>
           <w:sz w:val="22"/>
         </w:rPr>
-        <w:t>Contributed to initiatives focused on reducing maintenance overhead, improving deployment stability, and modernising internal engineering practices.</w:t>
+        <w:t>Helped modernise engineering practices by simplifying deployments, improving testing and reducing maintenance overhead.</w:t>
       </w:r>
     </w:p>
     <w:p>
@@ -1117,7 +1117,7 @@
           <w:color w:val="222222"/>
           <w:sz w:val="22"/>
         </w:rPr>
-        <w:t>Developed frontend features and internal workflow tooling for promotional and content-delivery systems used across high-volume product operations.</w:t>
+        <w:t>Built frontend features and internal tools for promotional platforms used by multiple gaming brands, supporting both customer-facing products and the teams behind them.</w:t>
       </w:r>
     </w:p>
     <w:p>
@@ -1149,7 +1149,7 @@
           <w:color w:val="222222"/>
           <w:sz w:val="22"/>
         </w:rPr>
-        <w:t>Designed and developed deployment-visibility tooling integrating with the GitHub REST API to improve operational transparency and reduce troubleshooting overhead.</w:t>
+        <w:t>Built internal tooling that gave teams better visibility into deployments and made troubleshooting much easier.</w:t>
       </w:r>
     </w:p>
     <w:p>
@@ -1165,7 +1165,7 @@
           <w:color w:val="222222"/>
           <w:sz w:val="22"/>
         </w:rPr>
-        <w:t>Engineered a reusable Node.js wrapper around the GitHub REST API that enabled zero-clone Git operations and reduced deployment-processing time.</w:t>
+        <w:t>Built a reusable Node.js wrapper around the GitHub REST API that removed the need to clone repositories and significantly reduced deployment processing time.</w:t>
       </w:r>
     </w:p>
     <w:p>
@@ -1297,7 +1297,7 @@
           <w:color w:val="222222"/>
           <w:sz w:val="22"/>
         </w:rPr>
-        <w:t>Co-developed browser-based e-learning platforms and interactive educational products for client projects, focusing on frontend development, user experience, and collaborative delivery.</w:t>
+        <w:t>Co-founded a small software company building browser-based learning platforms and interactive educational products for corporate clients.</w:t>
       </w:r>
     </w:p>
     <w:p>
@@ -1329,7 +1329,7 @@
           <w:color w:val="222222"/>
           <w:sz w:val="22"/>
         </w:rPr>
-        <w:t>Developed frontend interfaces and custom LMS functionality supporting content delivery, interactive learning workflows, and user engagement.</w:t>
+        <w:t>Built frontend interfaces and customised Moodle-based learning platforms for different client needs.</w:t>
       </w:r>
     </w:p>
     <w:p>
@@ -1361,7 +1361,7 @@
           <w:color w:val="222222"/>
           <w:sz w:val="22"/>
         </w:rPr>
-        <w:t>Worked across frontend implementation, client collaboration, deployment coordination, and product customisation within collaborative delivery teams.</w:t>
+        <w:t>Worked directly with clients to understand requirements, customise products and support deployments across multiple projects.</w:t>
       </w:r>
     </w:p>
     <w:p>
@@ -1497,7 +1497,7 @@
           <w:color w:val="222222"/>
           <w:sz w:val="22"/>
         </w:rPr>
-        <w:t>SwiftUI-based product engineering project built to explore modern mobile architecture, AI-assisted development workflows, onboarding experiences, and maintainable application design.</w:t>
+        <w:t>Personal SwiftUI project created to learn modern iOS development while exploring AI-assisted development, product design, and ways to reduce cognitive load through thoughtful user workflows.</w:t>
       </w:r>
     </w:p>
     <w:p>
@@ -1513,7 +1513,7 @@
           <w:color w:val="222222"/>
           <w:sz w:val="22"/>
         </w:rPr>
-        <w:t>Built product flows covering onboarding, recommendation handling, notifications, async refresh logic, and session-aware navigation.</w:t>
+        <w:t>Built core product flows including onboarding, recommendations, notifications, async data refresh, and session-aware navigation.</w:t>
       </w:r>
     </w:p>
     <w:p>
@@ -1529,7 +1529,7 @@
           <w:color w:val="222222"/>
           <w:sz w:val="22"/>
         </w:rPr>
-        <w:t>Used AI-assisted development workflows to accelerate implementation while maintaining review, testing, and verification standards.</w:t>
+        <w:t>Used AI-assisted development to speed up implementation while keeping code review, testing, and verification central to the process.</w:t>
       </w:r>
     </w:p>
     <w:p>
@@ -1545,7 +1545,7 @@
           <w:color w:val="222222"/>
           <w:sz w:val="22"/>
         </w:rPr>
-        <w:t>Developed testing and verification practices supporting maintainable implementation and collaborative iteration.</w:t>
+        <w:t>Experimented with testing and verification practices to better understand where AI-assisted development works well and where manual validation remains essential.</w:t>
       </w:r>
     </w:p>
     <w:p>
@@ -1561,7 +1561,7 @@
           <w:color w:val="222222"/>
           <w:sz w:val="22"/>
         </w:rPr>
-        <w:t>Built as an end-to-end product engineering exercise covering product flows, API integration, state management, testing practices, and collaborative frontend/backend delivery.</w:t>
+        <w:t>The project has become an opportunity to explore the full product lifecycle, from UX decisions and frontend architecture through to API integration, testing, and collaborating with a backend engineer.</w:t>
       </w:r>
     </w:p>
     <w:p>
@@ -1586,7 +1586,7 @@
           <w:color w:val="5E6470"/>
           <w:sz w:val="21"/>
         </w:rPr>
-        <w:t xml:space="preserve"> SwiftUI, Swift, REST APIs, Firebase, SignalR, XcodeGen, Testing, Workflow Automation</w:t>
+        <w:t xml:space="preserve"> SwiftUI, Swift, REST APIs, Firebase, SignalR, XcodeGen, XCTest</w:t>
       </w:r>
     </w:p>
     <w:p>

</xml_diff>

<commit_message>
Refactor resume builder architecture
</commit_message>
<xml_diff>
--- a/docs/my-resume.docx
+++ b/docs/my-resume.docx
@@ -35,7 +35,7 @@
           <w:color w:val="2F5FA7"/>
           <w:sz w:val="32"/>
         </w:rPr>
-        <w:t>Senior Frontend Engineer</w:t>
+        <w:t>Senior Software Engineer (Frontend / Product Engineering)</w:t>
       </w:r>
     </w:p>
     <w:p>
@@ -66,7 +66,7 @@
           <w:color w:val="5E6470"/>
           <w:sz w:val="21"/>
         </w:rPr>
-        <w:t>Hove, United Kingdom</w:t>
+        <w:t>Hove, England, United Kingdom</w:t>
       </w:r>
     </w:p>
     <w:p>
@@ -131,7 +131,7 @@
           <w:color w:val="222222"/>
           <w:sz w:val="22"/>
         </w:rPr>
-        <w:t>Senior Frontend Engineer with 13+ years of experience building web applications with React, TypeScript and modern frontend technologies.</w:t>
+        <w:t>Senior Software Engineer specialising in frontend product engineering with 13+ years of experience delivering product-focused web applications across React, TypeScript, frontend architecture, and engineering workflow improvement.</w:t>
       </w:r>
     </w:p>
     <w:p>
@@ -146,7 +146,7 @@
           <w:color w:val="222222"/>
           <w:sz w:val="22"/>
         </w:rPr>
-        <w:t>Most of my career has been spent in product teams, turning complex problems into maintainable software while making everyday work a little easier for both users and engineers. Alongside customer-facing features, I've built internal tools that reduced manual work, simplified onboarding, and made development and deployment more reliable.</w:t>
+        <w:t>Experienced in identifying operational friction, improving delivery systems, and building user-facing products in collaboration with product, design, and backend teams. Recent work has included deployment automation across 29 repositories, internal tooling that reduced operational processes from days to minutes, and frontend systems supporting complex operational workflows and decision-making.</w:t>
       </w:r>
     </w:p>
     <w:p>
@@ -161,7 +161,7 @@
           <w:color w:val="222222"/>
           <w:sz w:val="22"/>
         </w:rPr>
-        <w:t>I enjoy understanding how people actually use software, spotting where things become unnecessarily difficult, and working with product, design and backend teams to simplify those workflows without making the codebase harder to maintain.</w:t>
+        <w:t>Strongest areas include product engineering, frontend architecture, developer experience, workflow reliability, AI-assisted engineering workflows, and cross-functional product delivery. Particularly interested in understanding user problems, collaborating closely with stakeholders, and building maintainable solutions that balance engineering quality, product outcomes, and sustainable delivery.</w:t>
       </w:r>
     </w:p>
     <w:p>
@@ -223,7 +223,7 @@
           <w:color w:val="2F5FA7"/>
           <w:sz w:val="22"/>
         </w:rPr>
-        <w:t>Product Development</w:t>
+        <w:t>Product Engineering</w:t>
       </w:r>
       <w:r>
         <w:rPr>
@@ -233,7 +233,7 @@
           <w:color w:val="222222"/>
           <w:sz w:val="22"/>
         </w:rPr>
-        <w:t>: Frontend Architecture, API Integration, State Management, UX, Accessibility, Design Systems</w:t>
+        <w:t>: Product Engineering, Product Discovery, Frontend Architecture, State Management, API Integration, UX Workflows, Accessibility, Cross-Functional Delivery</w:t>
       </w:r>
     </w:p>
     <w:p>
@@ -249,7 +249,7 @@
           <w:color w:val="2F5FA7"/>
           <w:sz w:val="22"/>
         </w:rPr>
-        <w:t>Quality &amp; Delivery</w:t>
+        <w:t>Testing &amp; Reliability</w:t>
       </w:r>
       <w:r>
         <w:rPr>
@@ -259,7 +259,7 @@
           <w:color w:val="222222"/>
           <w:sz w:val="22"/>
         </w:rPr>
-        <w:t>: Jest, React Testing Library, Cypress, Playwright, CI/CD, Observability</w:t>
+        <w:t>: Jest, React Testing Library, Cypress, Playwright, WebDriverIO, CI/CD, Observability</w:t>
       </w:r>
     </w:p>
     <w:p>
@@ -275,7 +275,7 @@
           <w:color w:val="2F5FA7"/>
           <w:sz w:val="22"/>
         </w:rPr>
-        <w:t>Developer Experience</w:t>
+        <w:t>Workflow &amp; DX</w:t>
       </w:r>
       <w:r>
         <w:rPr>
@@ -285,7 +285,7 @@
           <w:color w:val="222222"/>
           <w:sz w:val="22"/>
         </w:rPr>
-        <w:t>: GitHub Actions, Azure DevOps, Jenkins, Nx, Webpack, Process Automation</w:t>
+        <w:t>: GitHub Actions, Jenkins, Azure DevOps, Nx, Webpack, Developer Experience (DX), Process Automation</w:t>
       </w:r>
     </w:p>
     <w:p>
@@ -301,7 +301,7 @@
           <w:color w:val="2F5FA7"/>
           <w:sz w:val="22"/>
         </w:rPr>
-        <w:t>Other</w:t>
+        <w:t>Supporting Technologies</w:t>
       </w:r>
       <w:r>
         <w:rPr>
@@ -422,7 +422,7 @@
           <w:color w:val="222222"/>
           <w:sz w:val="22"/>
         </w:rPr>
-        <w:t>Took a planned career break after relocating to the UK to focus on professional development, experiment with AI-assisted software development, and build personal product projects while continuing hands-on development with SwiftUI, React and TypeScript.</w:t>
+        <w:t>Structured sabbatical focused on technical modernisation, AI-assisted engineering workflows, sustainable work practices, and hands-on product development across frontend and mobile technologies.</w:t>
       </w:r>
     </w:p>
     <w:tbl>
@@ -513,7 +513,7 @@
           <w:color w:val="222222"/>
           <w:sz w:val="22"/>
         </w:rPr>
-        <w:t>Worked on Signal Ocean, a maritime intelligence platform used by brokers, operators and analysts to monitor vessel activity and support commercial decision-making.</w:t>
+        <w:t>Worked on the Signal Ocean platform, a maritime intelligence product used by charterers, brokers, operators, and analysts to monitor vessel activity, manage operational workflows, and make data-driven commercial decisions using large-scale shipping and market data.</w:t>
       </w:r>
     </w:p>
     <w:p>
@@ -529,7 +529,7 @@
           <w:color w:val="222222"/>
           <w:sz w:val="22"/>
         </w:rPr>
-        <w:t>One recurring request was creating new vessel lists for users. I helped move that into a self-service workflow so they could manage it themselves.</w:t>
+        <w:t>Shipped and maintained frontend functionality for vessel-monitoring, analytics, and operational workflow experiences combining large-scale maritime datasets, interactive maps, and configurable user workspaces.</w:t>
       </w:r>
     </w:p>
     <w:p>
@@ -545,7 +545,7 @@
           <w:color w:val="222222"/>
           <w:sz w:val="22"/>
         </w:rPr>
-        <w:t>Worked closely with backend engineers to design a metadata-driven approach that made vessel list configuration reusable across different dashboards.</w:t>
+        <w:t>Collaborated with backend engineers on metadata-driven vessel-list configuration workflows, enabling reusable templates and self-service customization across operational dashboards.</w:t>
       </w:r>
     </w:p>
     <w:p>
@@ -561,7 +561,7 @@
           <w:color w:val="222222"/>
           <w:sz w:val="22"/>
         </w:rPr>
-        <w:t>Owned the frontend implementation for vessel list workflows, covering API integration, shared state management and interactive map experiences.</w:t>
+        <w:t>Delivered self-service configuration capabilities that enabled users to create and manage vessel-list templates without manual platform intervention, improving workflow flexibility and usability.</w:t>
       </w:r>
     </w:p>
     <w:p>
@@ -577,7 +577,7 @@
           <w:color w:val="222222"/>
           <w:sz w:val="22"/>
         </w:rPr>
-        <w:t>Developed features across vessel monitoring, analytics and operational dashboards, working with large datasets and map-based interfaces.</w:t>
+        <w:t>Owned frontend implementation for vessel-list workflows spanning API integration, shared state management, and map-driven operational experiences within a maritime analytics platform.</w:t>
       </w:r>
     </w:p>
     <w:p>
@@ -593,7 +593,7 @@
           <w:color w:val="222222"/>
           <w:sz w:val="22"/>
         </w:rPr>
-        <w:t>Worked in a domain I knew very little about initially, learning the shipping industry quickly enough to contribute across product and engineering discussions.</w:t>
+        <w:t>Contributed to maintainable delivery practices within a cross-functional engineering environment while working in a complex domain requiring deep understanding of vessel data, operational workflows, and maritime market concepts.</w:t>
       </w:r>
     </w:p>
     <w:p>
@@ -709,7 +709,7 @@
           <w:color w:val="222222"/>
           <w:sz w:val="22"/>
         </w:rPr>
-        <w:t>My role gradually became less about building individual features and more about helping multiple frontend teams improve the way they worked, from onboarding and tooling to release processes.</w:t>
+        <w:t>Led frontend delivery and workflow improvements for cross-functional product initiatives, collaborating with architects, backend teams, and frontend engineers to improve delivery quality and release reliability across multiple projects.</w:t>
       </w:r>
     </w:p>
     <w:p>
@@ -725,7 +725,7 @@
           <w:color w:val="222222"/>
           <w:sz w:val="22"/>
         </w:rPr>
-        <w:t>Introduced Pull Request automation and CI quality gates across 29 frontend repositories, reducing manual work and making releases more consistent.</w:t>
+        <w:t>Improved deployment reliability and feedback cycles by introducing Pull Request automation, static analysis, and CI quality gates across 29 frontend repositories using GitHub Actions and SonarQube.</w:t>
       </w:r>
     </w:p>
     <w:p>
@@ -741,7 +741,7 @@
           <w:color w:val="222222"/>
           <w:sz w:val="22"/>
         </w:rPr>
-        <w:t>Worked with architects, backend engineers and frontend teams to improve shared tooling used across React projects.</w:t>
+        <w:t>Coordinated cross-functional frontend initiatives involving React, Svelte, and shared platform tooling across multiple teams and delivery streams.</w:t>
       </w:r>
     </w:p>
     <w:p>
@@ -757,7 +757,7 @@
           <w:color w:val="222222"/>
           <w:sz w:val="22"/>
         </w:rPr>
-        <w:t>Created architecture diagrams, dependency maps and onboarding guides that helped new engineers become productive more quickly.</w:t>
+        <w:t>Led onboarding and documentation modernization efforts, creating dependency maps, architectural diagrams, and structured guidance that improved developer self-sufficiency and reduced reliance on tribal knowledge.</w:t>
       </w:r>
     </w:p>
     <w:p>
@@ -773,7 +773,7 @@
           <w:color w:val="222222"/>
           <w:sz w:val="22"/>
         </w:rPr>
-        <w:t>Contributed to roadmap discussions and frontend platform improvements while balancing technical debt with ongoing product delivery.</w:t>
+        <w:t>Helped shape frontend modernization initiatives through roadmap planning, architecture discussions, platform tooling improvements, and delivery coordination across multiple teams.</w:t>
       </w:r>
     </w:p>
     <w:p>
@@ -789,7 +789,7 @@
           <w:color w:val="222222"/>
           <w:sz w:val="22"/>
         </w:rPr>
-        <w:t>Helped standardise development practices that made projects easier to maintain and reduced day-to-day friction for engineers.</w:t>
+        <w:t>Reduced operational friction and improved deployment reliability by standardising development practices, strengthening onboarding flows, and simplifying frontend maintenance.</w:t>
       </w:r>
     </w:p>
     <w:p>
@@ -905,7 +905,7 @@
           <w:color w:val="222222"/>
           <w:sz w:val="22"/>
         </w:rPr>
-        <w:t>Worked on both customer-facing products and the internal tools that supported them, with a growing focus on reducing manual work, improving onboarding, and making everyday engineering tasks easier.</w:t>
+        <w:t>Worked across frontend platforms, workflow tooling, and internal delivery systems to improve engineering efficiency, onboarding quality, and cross-team collaboration for promotional and content-delivery products.</w:t>
       </w:r>
     </w:p>
     <w:p>
@@ -921,7 +921,7 @@
           <w:color w:val="222222"/>
           <w:sz w:val="22"/>
         </w:rPr>
-        <w:t>Noticed a bottleneck in the promotional content workflow and built a Node.js tool around the Jira REST API that reduced turnaround time from 2-3 days to around 15 minutes.</w:t>
+        <w:t>Identified an operational bottleneck and delivered a Node.js CLI tool integrating with the Jira REST API to automate offer-content production, reducing lead time from 2–3 days to about 15 minutes.</w:t>
       </w:r>
     </w:p>
     <w:p>
@@ -937,7 +937,7 @@
           <w:color w:val="222222"/>
           <w:sz w:val="22"/>
         </w:rPr>
-        <w:t>Updated legacy internal tooling by redesigning data contracts and integrating with the GitHub REST API to improve content preview and testing.</w:t>
+        <w:t>Modernised legacy internal tooling by defining new data contracts and integrating with the GitHub REST API to improve content browsing, preview, and production testing.</w:t>
       </w:r>
     </w:p>
     <w:p>
@@ -953,7 +953,7 @@
           <w:color w:val="222222"/>
           <w:sz w:val="22"/>
         </w:rPr>
-        <w:t>Built internal tools and deployment workflows that removed repetitive manual work for both engineering and content teams.</w:t>
+        <w:t>Reduced coordination overhead and delivery friction by building internal tooling and deployment workflows that simplified release processes across engineering and content teams.</w:t>
       </w:r>
     </w:p>
     <w:p>
@@ -985,7 +985,7 @@
           <w:color w:val="222222"/>
           <w:sz w:val="22"/>
         </w:rPr>
-        <w:t>Supported the team through mentoring, code reviews, production troubleshooting and day-to-day technical collaboration.</w:t>
+        <w:t>Improved team effectiveness through mentoring, code pairing, testing practices, production troubleshooting, and knowledge sharing across frontend teams.</w:t>
       </w:r>
     </w:p>
     <w:p>
@@ -1001,7 +1001,7 @@
           <w:color w:val="222222"/>
           <w:sz w:val="22"/>
         </w:rPr>
-        <w:t>Helped modernise engineering practices by simplifying deployments, improving testing and reducing maintenance overhead.</w:t>
+        <w:t>Contributed to initiatives focused on reducing maintenance overhead, improving deployment stability, and modernising internal engineering practices.</w:t>
       </w:r>
     </w:p>
     <w:p>
@@ -1117,7 +1117,7 @@
           <w:color w:val="222222"/>
           <w:sz w:val="22"/>
         </w:rPr>
-        <w:t>Built frontend features and internal tools for promotional platforms used by multiple gaming brands, supporting both customer-facing products and the teams behind them.</w:t>
+        <w:t>Developed frontend features and internal workflow tooling for promotional and content-delivery systems used across high-volume product operations.</w:t>
       </w:r>
     </w:p>
     <w:p>
@@ -1149,7 +1149,7 @@
           <w:color w:val="222222"/>
           <w:sz w:val="22"/>
         </w:rPr>
-        <w:t>Built internal tooling that gave teams better visibility into deployments and made troubleshooting much easier.</w:t>
+        <w:t>Designed and developed deployment-visibility tooling integrating with the GitHub REST API to improve operational transparency and reduce troubleshooting overhead.</w:t>
       </w:r>
     </w:p>
     <w:p>
@@ -1165,7 +1165,7 @@
           <w:color w:val="222222"/>
           <w:sz w:val="22"/>
         </w:rPr>
-        <w:t>Built a reusable Node.js wrapper around the GitHub REST API that removed the need to clone repositories and significantly reduced deployment processing time.</w:t>
+        <w:t>Engineered a reusable Node.js wrapper around the GitHub REST API that enabled zero-clone Git operations and reduced deployment-processing time.</w:t>
       </w:r>
     </w:p>
     <w:p>
@@ -1297,7 +1297,7 @@
           <w:color w:val="222222"/>
           <w:sz w:val="22"/>
         </w:rPr>
-        <w:t>Co-founded a small software company building browser-based learning platforms and interactive educational products for corporate clients.</w:t>
+        <w:t>Co-founded and helped grow an EdTech company specialising in corporate learning solutions, developing browser-based learning platforms and interactive educational products for enterprise clients. Combined frontend engineering, product delivery, and direct client collaboration across the full project lifecycle.</w:t>
       </w:r>
     </w:p>
     <w:p>
@@ -1329,7 +1329,7 @@
           <w:color w:val="222222"/>
           <w:sz w:val="22"/>
         </w:rPr>
-        <w:t>Built frontend interfaces and customised Moodle-based learning platforms for different client needs.</w:t>
+        <w:t>Developed frontend interfaces and custom LMS functionality supporting content delivery, interactive learning workflows, and user engagement.</w:t>
       </w:r>
     </w:p>
     <w:p>
@@ -1361,7 +1361,7 @@
           <w:color w:val="222222"/>
           <w:sz w:val="22"/>
         </w:rPr>
-        <w:t>Worked directly with clients to understand requirements, customise products and support deployments across multiple projects.</w:t>
+        <w:t>Worked across frontend implementation, client collaboration, deployment coordination, and product customisation within collaborative delivery teams.</w:t>
       </w:r>
     </w:p>
     <w:p>
@@ -1497,7 +1497,7 @@
           <w:color w:val="222222"/>
           <w:sz w:val="22"/>
         </w:rPr>
-        <w:t>Personal SwiftUI project created to learn modern iOS development while exploring AI-assisted development, product design, and ways to reduce cognitive load through thoughtful user workflows.</w:t>
+        <w:t>SwiftUI-based iOS application developed to explore modern mobile architecture, AI-assisted engineering workflows, onboarding experiences, and maintainable application design.</w:t>
       </w:r>
     </w:p>
     <w:p>
@@ -1513,7 +1513,7 @@
           <w:color w:val="222222"/>
           <w:sz w:val="22"/>
         </w:rPr>
-        <w:t>Built core product flows including onboarding, recommendations, notifications, async data refresh, and session-aware navigation.</w:t>
+        <w:t>Built product flows covering onboarding, recommendation handling, notifications, async refresh logic, and session-aware navigation.</w:t>
       </w:r>
     </w:p>
     <w:p>
@@ -1529,7 +1529,7 @@
           <w:color w:val="222222"/>
           <w:sz w:val="22"/>
         </w:rPr>
-        <w:t>Used AI-assisted development to speed up implementation while keeping code review, testing, and verification central to the process.</w:t>
+        <w:t>Used AI-assisted development workflows to prototype, iterate, accelerate implementation, and validate solutions while maintaining review, testing, and verification standards.</w:t>
       </w:r>
     </w:p>
     <w:p>
@@ -1545,7 +1545,7 @@
           <w:color w:val="222222"/>
           <w:sz w:val="22"/>
         </w:rPr>
-        <w:t>Experimented with testing and verification practices to better understand where AI-assisted development works well and where manual validation remains essential.</w:t>
+        <w:t>Developed testing and verification practices supporting maintainable implementation and collaborative iteration.</w:t>
       </w:r>
     </w:p>
     <w:p>
@@ -1561,7 +1561,7 @@
           <w:color w:val="222222"/>
           <w:sz w:val="22"/>
         </w:rPr>
-        <w:t>The project has become an opportunity to explore the full product lifecycle, from UX decisions and frontend architecture through to API integration, testing, and collaborating with a backend engineer.</w:t>
+        <w:t>Built as an end-to-end product engineering exercise covering product flows, API integration, state management, testing practices, and collaborative frontend/backend delivery.</w:t>
       </w:r>
     </w:p>
     <w:p>
@@ -1586,7 +1586,7 @@
           <w:color w:val="5E6470"/>
           <w:sz w:val="21"/>
         </w:rPr>
-        <w:t xml:space="preserve"> SwiftUI, Swift, REST APIs, Firebase, SignalR, XcodeGen, XCTest</w:t>
+        <w:t xml:space="preserve"> SwiftUI, Swift, REST APIs, Firebase, SignalR, XcodeGen, Testing, Workflow Automation</w:t>
       </w:r>
     </w:p>
     <w:p>

</xml_diff>